<commit_message>
Replace ML labsheet 1.docx with updated version
</commit_message>
<xml_diff>
--- a/Labsheet 1.docx
+++ b/Labsheet 1.docx
@@ -1,3242 +1,7 @@
 
 <file path=word/document.xml><?xml version="1.0" encoding="utf-8"?>
-<w:document xmlns:wpc="http://schemas.microsoft.com/office/word/2010/wordprocessingCanvas" xmlns:cx="http://schemas.microsoft.com/office/drawing/2014/chartex" xmlns:cx1="http://schemas.microsoft.com/office/drawing/2015/9/8/chartex" xmlns:cx2="http://schemas.microsoft.com/office/drawing/2015/10/21/chartex" xmlns:cx3="http://schemas.microsoft.com/office/drawing/2016/5/9/chartex" xmlns:cx4="http://schemas.microsoft.com/office/drawing/2016/5/10/chartex" xmlns:cx5="http://schemas.microsoft.com/office/drawing/2016/5/11/chartex" xmlns:cx6="http://schemas.microsoft.com/office/drawing/2016/5/12/chartex" xmlns:cx7="http://schemas.microsoft.com/office/drawing/2016/5/13/chartex" xmlns:cx8="http://schemas.microsoft.com/office/drawing/2016/5/14/chartex" xmlns:mc="http://schemas.openxmlformats.org/markup-compatibility/2006" xmlns:aink="http://schemas.microsoft.com/office/drawing/2016/ink" xmlns:am3d="http://schemas.microsoft.com/office/drawing/2017/model3d" xmlns:o="urn:schemas-microsoft-com:office:office" xmlns:oel="http://schemas.microsoft.com/office/2019/extlst" xmlns:r="http://schemas.openxmlformats.org/officeDocument/2006/relationships" xmlns:m="http://schemas.openxmlformats.org/officeDocument/2006/math" xmlns:v="urn:schemas-microsoft-com:vml" xmlns:wp14="http://schemas.microsoft.com/office/word/2010/wordprocessingDrawing" xmlns:wp="http://schemas.openxmlformats.org/drawingml/2006/wordprocessingDrawing" xmlns:w10="urn:schemas-microsoft-com:office:word" xmlns:w="http://schemas.openxmlformats.org/wordprocessingml/2006/main" xmlns:w14="http://schemas.microsoft.com/office/word/2010/wordml" xmlns:w15="http://schemas.microsoft.com/office/word/2012/wordml" xmlns:w16cei="http://schemas.microsoft.com/office/word/2026/wordml/cei" xmlns:w16cex="http://schemas.microsoft.com/office/word/2018/wordml/cex" xmlns:w16cid="http://schemas.microsoft.com/office/word/2016/wordml/cid" xmlns:w16="http://schemas.microsoft.com/office/word/2018/wordml" xmlns:w16du="http://schemas.microsoft.com/office/word/2023/wordml/word16du" xmlns:w16sdtdh="http://schemas.microsoft.com/office/word/2020/wordml/sdtdatahash" xmlns:w16sdtfl="http://schemas.microsoft.com/office/word/2024/wordml/sdtformatlock" xmlns:w16se="http://schemas.microsoft.com/office/word/2015/wordml/symex" xmlns:wpg="http://schemas.microsoft.com/office/word/2010/wordprocessingGroup" xmlns:wpi="http://schemas.microsoft.com/office/word/2010/wordprocessingInk" xmlns:wne="http://schemas.microsoft.com/office/word/2006/wordml" xmlns:wps="http://schemas.microsoft.com/office/word/2010/wordprocessingShape" mc:Ignorable="w14 w15 w16se w16cid w16 w16cex w16sdtdh w16sdtfl w16du wp14">
+<w:document xmlns:wpc="http://schemas.microsoft.com/office/word/2010/wordprocessingCanvas" xmlns:cx="http://schemas.microsoft.com/office/drawing/2014/chartex" xmlns:cx1="http://schemas.microsoft.com/office/drawing/2015/9/8/chartex" xmlns:cx2="http://schemas.microsoft.com/office/drawing/2015/10/21/chartex" xmlns:cx3="http://schemas.microsoft.com/office/drawing/2016/5/9/chartex" xmlns:cx4="http://schemas.microsoft.com/office/drawing/2016/5/10/chartex" xmlns:cx5="http://schemas.microsoft.com/office/drawing/2016/5/11/chartex" xmlns:cx6="http://schemas.microsoft.com/office/drawing/2016/5/12/chartex" xmlns:cx7="http://schemas.microsoft.com/office/drawing/2016/5/13/chartex" xmlns:cx8="http://schemas.microsoft.com/office/drawing/2016/5/14/chartex" xmlns:mc="http://schemas.openxmlformats.org/markup-compatibility/2006" xmlns:aink="http://schemas.microsoft.com/office/drawing/2016/ink" xmlns:am3d="http://schemas.microsoft.com/office/drawing/2017/model3d" xmlns:o="urn:schemas-microsoft-com:office:office" xmlns:oel="http://schemas.microsoft.com/office/2019/extlst" xmlns:r="http://schemas.openxmlformats.org/officeDocument/2006/relationships" xmlns:m="http://schemas.openxmlformats.org/officeDocument/2006/math" xmlns:v="urn:schemas-microsoft-com:vml" xmlns:wp14="http://schemas.microsoft.com/office/word/2010/wordprocessingDrawing" xmlns:wp="http://schemas.openxmlformats.org/drawingml/2006/wordprocessingDrawing" xmlns:w10="urn:schemas-microsoft-com:office:word" xmlns:w="http://schemas.openxmlformats.org/wordprocessingml/2006/main" xmlns:w14="http://schemas.microsoft.com/office/word/2010/wordml" xmlns:w15="http://schemas.microsoft.com/office/word/2012/wordml" xmlns:w16cex="http://schemas.microsoft.com/office/word/2018/wordml/cex" xmlns:w16cid="http://schemas.microsoft.com/office/word/2016/wordml/cid" xmlns:w16="http://schemas.microsoft.com/office/word/2018/wordml" xmlns:w16du="http://schemas.microsoft.com/office/word/2023/wordml/word16du" xmlns:w16sdtdh="http://schemas.microsoft.com/office/word/2020/wordml/sdtdatahash" xmlns:w16sdtfl="http://schemas.microsoft.com/office/word/2024/wordml/sdtformatlock" xmlns:w16se="http://schemas.microsoft.com/office/word/2015/wordml/symex" xmlns:wpg="http://schemas.microsoft.com/office/word/2010/wordprocessingGroup" xmlns:wpi="http://schemas.microsoft.com/office/word/2010/wordprocessingInk" xmlns:wne="http://schemas.microsoft.com/office/word/2006/wordml" xmlns:wps="http://schemas.microsoft.com/office/word/2010/wordprocessingShape" mc:Ignorable="w14 w15 w16se w16cid w16 w16cex w16sdtdh w16sdtfl w16du wp14">
   <w:body>
-    <w:p>
-      <w:pPr>
-        <w:pStyle w:val="BodyText"/>
-        <w:rPr>
-          <w:rFonts w:ascii="Times New Roman"/>
-          <w:b w:val="0"/>
-          <w:sz w:val="34"/>
-        </w:rPr>
-      </w:pPr>
-    </w:p>
-    <w:p>
-      <w:pPr>
-        <w:pStyle w:val="BodyText"/>
-        <w:spacing w:before="115"/>
-        <w:rPr>
-          <w:rFonts w:ascii="Times New Roman"/>
-          <w:b w:val="0"/>
-          <w:sz w:val="34"/>
-        </w:rPr>
-      </w:pPr>
-    </w:p>
-    <w:p>
-      <w:pPr>
-        <w:pStyle w:val="Heading2"/>
-      </w:pPr>
-      <w:r>
-        <w:t>College</w:t>
-      </w:r>
-      <w:r>
-        <w:rPr>
-          <w:spacing w:val="-5"/>
-        </w:rPr>
-        <w:t xml:space="preserve"> </w:t>
-      </w:r>
-      <w:r>
-        <w:t>of</w:t>
-      </w:r>
-      <w:r>
-        <w:rPr>
-          <w:spacing w:val="-5"/>
-        </w:rPr>
-        <w:t xml:space="preserve"> </w:t>
-      </w:r>
-      <w:r>
-        <w:t>Smart</w:t>
-      </w:r>
-      <w:r>
-        <w:rPr>
-          <w:spacing w:val="-4"/>
-        </w:rPr>
-        <w:t xml:space="preserve"> </w:t>
-      </w:r>
-      <w:r>
-        <w:rPr>
-          <w:spacing w:val="-2"/>
-        </w:rPr>
-        <w:t>Computing</w:t>
-      </w:r>
-    </w:p>
-    <w:p>
-      <w:pPr>
-        <w:pStyle w:val="BodyText"/>
-      </w:pPr>
-    </w:p>
-    <w:p>
-      <w:pPr>
-        <w:pStyle w:val="BodyText"/>
-        <w:spacing w:before="136"/>
-      </w:pPr>
-      <w:r>
-        <w:rPr>
-          <w:noProof/>
-        </w:rPr>
-        <w:drawing>
-          <wp:anchor distT="0" distB="0" distL="0" distR="0" simplePos="0" relativeHeight="251655680" behindDoc="1" locked="0" layoutInCell="1" allowOverlap="1" wp14:anchorId="3D77C987" wp14:editId="1CFD4DF6">
-            <wp:simplePos x="0" y="0"/>
-            <wp:positionH relativeFrom="page">
-              <wp:posOffset>1019175</wp:posOffset>
-            </wp:positionH>
-            <wp:positionV relativeFrom="paragraph">
-              <wp:posOffset>255049</wp:posOffset>
-            </wp:positionV>
-            <wp:extent cx="5581650" cy="895350"/>
-            <wp:effectExtent l="0" t="0" r="0" b="0"/>
-            <wp:wrapTopAndBottom/>
-            <wp:docPr id="2" name="Image 2"/>
-            <wp:cNvGraphicFramePr>
-              <a:graphicFrameLocks xmlns:a="http://schemas.openxmlformats.org/drawingml/2006/main"/>
-            </wp:cNvGraphicFramePr>
-            <a:graphic xmlns:a="http://schemas.openxmlformats.org/drawingml/2006/main">
-              <a:graphicData uri="http://schemas.openxmlformats.org/drawingml/2006/picture">
-                <pic:pic xmlns:pic="http://schemas.openxmlformats.org/drawingml/2006/picture">
-                  <pic:nvPicPr>
-                    <pic:cNvPr id="2" name="Image 2"/>
-                    <pic:cNvPicPr/>
-                  </pic:nvPicPr>
-                  <pic:blipFill>
-                    <a:blip r:embed="rId7" cstate="print"/>
-                    <a:stretch>
-                      <a:fillRect/>
-                    </a:stretch>
-                  </pic:blipFill>
-                  <pic:spPr>
-                    <a:xfrm>
-                      <a:off x="0" y="0"/>
-                      <a:ext cx="5581650" cy="895350"/>
-                    </a:xfrm>
-                    <a:prstGeom prst="rect">
-                      <a:avLst/>
-                    </a:prstGeom>
-                  </pic:spPr>
-                </pic:pic>
-              </a:graphicData>
-            </a:graphic>
-          </wp:anchor>
-        </w:drawing>
-      </w:r>
-      <w:r>
-        <w:rPr>
-          <w:noProof/>
-        </w:rPr>
-        <w:drawing>
-          <wp:anchor distT="0" distB="0" distL="0" distR="0" simplePos="0" relativeHeight="251659776" behindDoc="1" locked="0" layoutInCell="1" allowOverlap="1" wp14:anchorId="372C37F7" wp14:editId="0E27AE90">
-            <wp:simplePos x="0" y="0"/>
-            <wp:positionH relativeFrom="page">
-              <wp:posOffset>866775</wp:posOffset>
-            </wp:positionH>
-            <wp:positionV relativeFrom="paragraph">
-              <wp:posOffset>4748997</wp:posOffset>
-            </wp:positionV>
-            <wp:extent cx="5976246" cy="38004"/>
-            <wp:effectExtent l="0" t="0" r="0" b="0"/>
-            <wp:wrapTopAndBottom/>
-            <wp:docPr id="4" name="Image 4"/>
-            <wp:cNvGraphicFramePr>
-              <a:graphicFrameLocks xmlns:a="http://schemas.openxmlformats.org/drawingml/2006/main"/>
-            </wp:cNvGraphicFramePr>
-            <a:graphic xmlns:a="http://schemas.openxmlformats.org/drawingml/2006/main">
-              <a:graphicData uri="http://schemas.openxmlformats.org/drawingml/2006/picture">
-                <pic:pic xmlns:pic="http://schemas.openxmlformats.org/drawingml/2006/picture">
-                  <pic:nvPicPr>
-                    <pic:cNvPr id="4" name="Image 4"/>
-                    <pic:cNvPicPr/>
-                  </pic:nvPicPr>
-                  <pic:blipFill>
-                    <a:blip r:embed="rId8" cstate="print"/>
-                    <a:stretch>
-                      <a:fillRect/>
-                    </a:stretch>
-                  </pic:blipFill>
-                  <pic:spPr>
-                    <a:xfrm>
-                      <a:off x="0" y="0"/>
-                      <a:ext cx="5976246" cy="38004"/>
-                    </a:xfrm>
-                    <a:prstGeom prst="rect">
-                      <a:avLst/>
-                    </a:prstGeom>
-                  </pic:spPr>
-                </pic:pic>
-              </a:graphicData>
-            </a:graphic>
-          </wp:anchor>
-        </w:drawing>
-      </w:r>
-    </w:p>
-    <w:p>
-      <w:pPr>
-        <w:pStyle w:val="BodyText"/>
-        <w:spacing w:before="214"/>
-      </w:pPr>
-      <w:r>
-        <w:rPr>
-          <w:noProof/>
-        </w:rPr>
-        <mc:AlternateContent>
-          <mc:Choice Requires="wps">
-            <w:drawing>
-              <wp:anchor distT="0" distB="0" distL="114300" distR="114300" simplePos="0" relativeHeight="487589888" behindDoc="0" locked="0" layoutInCell="1" allowOverlap="1" wp14:anchorId="6533BDEB" wp14:editId="51D1242F">
-                <wp:simplePos x="0" y="0"/>
-                <wp:positionH relativeFrom="column">
-                  <wp:posOffset>264102</wp:posOffset>
-                </wp:positionH>
-                <wp:positionV relativeFrom="paragraph">
-                  <wp:posOffset>1177290</wp:posOffset>
-                </wp:positionV>
-                <wp:extent cx="5611091" cy="2951018"/>
-                <wp:effectExtent l="0" t="0" r="27940" b="20955"/>
-                <wp:wrapNone/>
-                <wp:docPr id="17743049" name="Rectangle: Rounded Corners 2"/>
-                <wp:cNvGraphicFramePr/>
-                <a:graphic xmlns:a="http://schemas.openxmlformats.org/drawingml/2006/main">
-                  <a:graphicData uri="http://schemas.microsoft.com/office/word/2010/wordprocessingShape">
-                    <wps:wsp>
-                      <wps:cNvSpPr/>
-                      <wps:spPr>
-                        <a:xfrm>
-                          <a:off x="0" y="0"/>
-                          <a:ext cx="5611091" cy="2951018"/>
-                        </a:xfrm>
-                        <a:prstGeom prst="roundRect">
-                          <a:avLst/>
-                        </a:prstGeom>
-                      </wps:spPr>
-                      <wps:style>
-                        <a:lnRef idx="2">
-                          <a:schemeClr val="dk1"/>
-                        </a:lnRef>
-                        <a:fillRef idx="1">
-                          <a:schemeClr val="lt1"/>
-                        </a:fillRef>
-                        <a:effectRef idx="0">
-                          <a:schemeClr val="dk1"/>
-                        </a:effectRef>
-                        <a:fontRef idx="minor">
-                          <a:schemeClr val="dk1"/>
-                        </a:fontRef>
-                      </wps:style>
-                      <wps:txbx>
-                        <w:txbxContent>
-                          <w:p>
-                            <w:pPr>
-                              <w:rPr>
-                                <w:sz w:val="40"/>
-                                <w:szCs w:val="40"/>
-                                <w:lang w:val="en-IN"/>
-                              </w:rPr>
-                            </w:pPr>
-                            <w:r>
-                              <w:rPr>
-                                <w:sz w:val="40"/>
-                                <w:szCs w:val="40"/>
-                                <w:lang w:val="en-IN"/>
-                              </w:rPr>
-                              <w:t xml:space="preserve">Submitted </w:t>
-                            </w:r>
-                            <w:proofErr w:type="gramStart"/>
-                            <w:r>
-                              <w:rPr>
-                                <w:sz w:val="40"/>
-                                <w:szCs w:val="40"/>
-                                <w:lang w:val="en-IN"/>
-                              </w:rPr>
-                              <w:t>by :</w:t>
-                            </w:r>
-                            <w:proofErr w:type="gramEnd"/>
-                            <w:r>
-                              <w:rPr>
-                                <w:sz w:val="40"/>
-                                <w:szCs w:val="40"/>
-                                <w:lang w:val="en-IN"/>
-                              </w:rPr>
-                              <w:t xml:space="preserve"> Dhruv</w:t>
-                            </w:r>
-                          </w:p>
-                          <w:p>
-                            <w:pPr>
-                              <w:rPr>
-                                <w:sz w:val="40"/>
-                                <w:szCs w:val="40"/>
-                                <w:lang w:val="en-IN"/>
-                              </w:rPr>
-                            </w:pPr>
-                            <w:r>
-                              <w:rPr>
-                                <w:sz w:val="40"/>
-                                <w:szCs w:val="40"/>
-                                <w:lang w:val="en-IN"/>
-                              </w:rPr>
-                              <w:t xml:space="preserve">Submitted </w:t>
-                            </w:r>
-                            <w:proofErr w:type="gramStart"/>
-                            <w:r>
-                              <w:rPr>
-                                <w:sz w:val="40"/>
-                                <w:szCs w:val="40"/>
-                                <w:lang w:val="en-IN"/>
-                              </w:rPr>
-                              <w:t>to :</w:t>
-                            </w:r>
-                            <w:proofErr w:type="gramEnd"/>
-                            <w:r>
-                              <w:rPr>
-                                <w:sz w:val="40"/>
-                                <w:szCs w:val="40"/>
-                                <w:lang w:val="en-IN"/>
-                              </w:rPr>
-                              <w:t xml:space="preserve"> Mr. Naman Chauhan</w:t>
-                            </w:r>
-                          </w:p>
-                          <w:p>
-                            <w:pPr>
-                              <w:rPr>
-                                <w:sz w:val="40"/>
-                                <w:szCs w:val="40"/>
-                                <w:lang w:val="en-IN"/>
-                              </w:rPr>
-                            </w:pPr>
-                            <w:proofErr w:type="gramStart"/>
-                            <w:r>
-                              <w:rPr>
-                                <w:sz w:val="40"/>
-                                <w:szCs w:val="40"/>
-                                <w:lang w:val="en-IN"/>
-                              </w:rPr>
-                              <w:t>Department :</w:t>
-                            </w:r>
-                            <w:proofErr w:type="gramEnd"/>
-                            <w:r>
-                              <w:rPr>
-                                <w:sz w:val="40"/>
-                                <w:szCs w:val="40"/>
-                                <w:lang w:val="en-IN"/>
-                              </w:rPr>
-                              <w:t xml:space="preserve"> </w:t>
-                            </w:r>
-                            <w:proofErr w:type="spellStart"/>
-                            <w:r>
-                              <w:rPr>
-                                <w:sz w:val="40"/>
-                                <w:szCs w:val="40"/>
-                                <w:lang w:val="en-IN"/>
-                              </w:rPr>
-                              <w:t>Compuer</w:t>
-                            </w:r>
-                            <w:proofErr w:type="spellEnd"/>
-                            <w:r>
-                              <w:rPr>
-                                <w:sz w:val="40"/>
-                                <w:szCs w:val="40"/>
-                                <w:lang w:val="en-IN"/>
-                              </w:rPr>
-                              <w:t xml:space="preserve"> Science &amp; Application</w:t>
-                            </w:r>
-                          </w:p>
-                          <w:p>
-                            <w:pPr>
-                              <w:rPr>
-                                <w:sz w:val="40"/>
-                                <w:szCs w:val="40"/>
-                                <w:lang w:val="en-IN"/>
-                              </w:rPr>
-                            </w:pPr>
-                            <w:proofErr w:type="gramStart"/>
-                            <w:r>
-                              <w:rPr>
-                                <w:sz w:val="40"/>
-                                <w:szCs w:val="40"/>
-                                <w:lang w:val="en-IN"/>
-                              </w:rPr>
-                              <w:t>Semester :</w:t>
-                            </w:r>
-                            <w:proofErr w:type="gramEnd"/>
-                            <w:r>
-                              <w:rPr>
-                                <w:sz w:val="40"/>
-                                <w:szCs w:val="40"/>
-                                <w:lang w:val="en-IN"/>
-                              </w:rPr>
-                              <w:t xml:space="preserve"> 3</w:t>
-                            </w:r>
-                            <w:r>
-                              <w:rPr>
-                                <w:sz w:val="40"/>
-                                <w:szCs w:val="40"/>
-                                <w:vertAlign w:val="superscript"/>
-                                <w:lang w:val="en-IN"/>
-                              </w:rPr>
-                              <w:t>rd</w:t>
-                            </w:r>
-                            <w:r>
-                              <w:rPr>
-                                <w:sz w:val="40"/>
-                                <w:szCs w:val="40"/>
-                                <w:lang w:val="en-IN"/>
-                              </w:rPr>
-                              <w:t xml:space="preserve"> </w:t>
-                            </w:r>
-                          </w:p>
-                          <w:p>
-                            <w:pPr>
-                              <w:rPr>
-                                <w:sz w:val="40"/>
-                                <w:szCs w:val="40"/>
-                                <w:lang w:val="en-IN"/>
-                              </w:rPr>
-                            </w:pPr>
-                            <w:r>
-                              <w:rPr>
-                                <w:sz w:val="40"/>
-                                <w:szCs w:val="40"/>
-                                <w:lang w:val="en-IN"/>
-                              </w:rPr>
-                              <w:t xml:space="preserve">Academic </w:t>
-                            </w:r>
-                            <w:proofErr w:type="gramStart"/>
-                            <w:r>
-                              <w:rPr>
-                                <w:sz w:val="40"/>
-                                <w:szCs w:val="40"/>
-                                <w:lang w:val="en-IN"/>
-                              </w:rPr>
-                              <w:t>Session :</w:t>
-                            </w:r>
-                            <w:proofErr w:type="gramEnd"/>
-                            <w:r>
-                              <w:rPr>
-                                <w:sz w:val="40"/>
-                                <w:szCs w:val="40"/>
-                                <w:lang w:val="en-IN"/>
-                              </w:rPr>
-                              <w:t xml:space="preserve"> 2026-27</w:t>
-                            </w:r>
-                          </w:p>
-                          <w:p>
-                            <w:pPr>
-                              <w:rPr>
-                                <w:sz w:val="40"/>
-                                <w:szCs w:val="40"/>
-                                <w:lang w:val="en-IN"/>
-                              </w:rPr>
-                            </w:pPr>
-                            <w:r>
-                              <w:rPr>
-                                <w:sz w:val="40"/>
-                                <w:szCs w:val="40"/>
-                                <w:lang w:val="en-IN"/>
-                              </w:rPr>
-                              <w:t xml:space="preserve">Subject </w:t>
-                            </w:r>
-                            <w:proofErr w:type="gramStart"/>
-                            <w:r>
-                              <w:rPr>
-                                <w:sz w:val="40"/>
-                                <w:szCs w:val="40"/>
-                                <w:lang w:val="en-IN"/>
-                              </w:rPr>
-                              <w:t>Name :</w:t>
-                            </w:r>
-                            <w:proofErr w:type="gramEnd"/>
-                            <w:r>
-                              <w:rPr>
-                                <w:sz w:val="40"/>
-                                <w:szCs w:val="40"/>
-                                <w:lang w:val="en-IN"/>
-                              </w:rPr>
-                              <w:t xml:space="preserve"> Machine Learning Lab</w:t>
-                            </w:r>
-                          </w:p>
-                          <w:p>
-                            <w:pPr>
-                              <w:rPr>
-                                <w:sz w:val="40"/>
-                                <w:szCs w:val="40"/>
-                                <w:lang w:val="en-IN"/>
-                              </w:rPr>
-                            </w:pPr>
-                            <w:r>
-                              <w:rPr>
-                                <w:sz w:val="40"/>
-                                <w:szCs w:val="40"/>
-                                <w:lang w:val="en-IN"/>
-                              </w:rPr>
-                              <w:t xml:space="preserve">Subject </w:t>
-                            </w:r>
-                            <w:proofErr w:type="gramStart"/>
-                            <w:r>
-                              <w:rPr>
-                                <w:sz w:val="40"/>
-                                <w:szCs w:val="40"/>
-                                <w:lang w:val="en-IN"/>
-                              </w:rPr>
-                              <w:t>Code :</w:t>
-                            </w:r>
-                            <w:proofErr w:type="gramEnd"/>
-                            <w:r>
-                              <w:rPr>
-                                <w:sz w:val="40"/>
-                                <w:szCs w:val="40"/>
-                                <w:lang w:val="en-IN"/>
-                              </w:rPr>
-                              <w:t xml:space="preserve"> MCA201P</w:t>
-                            </w:r>
-                          </w:p>
-                        </w:txbxContent>
-                      </wps:txbx>
-                      <wps:bodyPr rot="0" spcFirstLastPara="0" vertOverflow="overflow" horzOverflow="overflow" vert="horz" wrap="square" lIns="91440" tIns="45720" rIns="91440" bIns="45720" numCol="1" spcCol="0" rtlCol="0" fromWordArt="0" anchor="ctr" anchorCtr="0" forceAA="0" compatLnSpc="1">
-                        <a:prstTxWarp prst="textNoShape">
-                          <a:avLst/>
-                        </a:prstTxWarp>
-                        <a:noAutofit/>
-                      </wps:bodyPr>
-                    </wps:wsp>
-                  </a:graphicData>
-                </a:graphic>
-              </wp:anchor>
-            </w:drawing>
-          </mc:Choice>
-          <mc:Fallback>
-            <w:pict>
-              <v:roundrect w14:anchorId="6533BDEB" id="Rectangle: Rounded Corners 2" o:spid="_x0000_s1026" style="position:absolute;margin-left:20.8pt;margin-top:92.7pt;width:441.8pt;height:232.35pt;z-index:487589888;visibility:visible;mso-wrap-style:square;mso-wrap-distance-left:9pt;mso-wrap-distance-top:0;mso-wrap-distance-right:9pt;mso-wrap-distance-bottom:0;mso-position-horizontal:absolute;mso-position-horizontal-relative:text;mso-position-vertical:absolute;mso-position-vertical-relative:text;v-text-anchor:middle" arcsize="10923f" o:gfxdata="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" fillcolor="white [3201]" strokecolor="black [3200]" strokeweight="2pt">
-                <v:textbox>
-                  <w:txbxContent>
-                    <w:p>
-                      <w:pPr>
-                        <w:rPr>
-                          <w:sz w:val="40"/>
-                          <w:szCs w:val="40"/>
-                          <w:lang w:val="en-IN"/>
-                        </w:rPr>
-                      </w:pPr>
-                      <w:r>
-                        <w:rPr>
-                          <w:sz w:val="40"/>
-                          <w:szCs w:val="40"/>
-                          <w:lang w:val="en-IN"/>
-                        </w:rPr>
-                        <w:t xml:space="preserve">Submitted </w:t>
-                      </w:r>
-                      <w:proofErr w:type="gramStart"/>
-                      <w:r>
-                        <w:rPr>
-                          <w:sz w:val="40"/>
-                          <w:szCs w:val="40"/>
-                          <w:lang w:val="en-IN"/>
-                        </w:rPr>
-                        <w:t>by :</w:t>
-                      </w:r>
-                      <w:proofErr w:type="gramEnd"/>
-                      <w:r>
-                        <w:rPr>
-                          <w:sz w:val="40"/>
-                          <w:szCs w:val="40"/>
-                          <w:lang w:val="en-IN"/>
-                        </w:rPr>
-                        <w:t xml:space="preserve"> Dhruv</w:t>
-                      </w:r>
-                    </w:p>
-                    <w:p>
-                      <w:pPr>
-                        <w:rPr>
-                          <w:sz w:val="40"/>
-                          <w:szCs w:val="40"/>
-                          <w:lang w:val="en-IN"/>
-                        </w:rPr>
-                      </w:pPr>
-                      <w:r>
-                        <w:rPr>
-                          <w:sz w:val="40"/>
-                          <w:szCs w:val="40"/>
-                          <w:lang w:val="en-IN"/>
-                        </w:rPr>
-                        <w:t xml:space="preserve">Submitted </w:t>
-                      </w:r>
-                      <w:proofErr w:type="gramStart"/>
-                      <w:r>
-                        <w:rPr>
-                          <w:sz w:val="40"/>
-                          <w:szCs w:val="40"/>
-                          <w:lang w:val="en-IN"/>
-                        </w:rPr>
-                        <w:t>to :</w:t>
-                      </w:r>
-                      <w:proofErr w:type="gramEnd"/>
-                      <w:r>
-                        <w:rPr>
-                          <w:sz w:val="40"/>
-                          <w:szCs w:val="40"/>
-                          <w:lang w:val="en-IN"/>
-                        </w:rPr>
-                        <w:t xml:space="preserve"> Mr. Naman Chauhan</w:t>
-                      </w:r>
-                    </w:p>
-                    <w:p>
-                      <w:pPr>
-                        <w:rPr>
-                          <w:sz w:val="40"/>
-                          <w:szCs w:val="40"/>
-                          <w:lang w:val="en-IN"/>
-                        </w:rPr>
-                      </w:pPr>
-                      <w:proofErr w:type="gramStart"/>
-                      <w:r>
-                        <w:rPr>
-                          <w:sz w:val="40"/>
-                          <w:szCs w:val="40"/>
-                          <w:lang w:val="en-IN"/>
-                        </w:rPr>
-                        <w:t>Department :</w:t>
-                      </w:r>
-                      <w:proofErr w:type="gramEnd"/>
-                      <w:r>
-                        <w:rPr>
-                          <w:sz w:val="40"/>
-                          <w:szCs w:val="40"/>
-                          <w:lang w:val="en-IN"/>
-                        </w:rPr>
-                        <w:t xml:space="preserve"> </w:t>
-                      </w:r>
-                      <w:proofErr w:type="spellStart"/>
-                      <w:r>
-                        <w:rPr>
-                          <w:sz w:val="40"/>
-                          <w:szCs w:val="40"/>
-                          <w:lang w:val="en-IN"/>
-                        </w:rPr>
-                        <w:t>Compuer</w:t>
-                      </w:r>
-                      <w:proofErr w:type="spellEnd"/>
-                      <w:r>
-                        <w:rPr>
-                          <w:sz w:val="40"/>
-                          <w:szCs w:val="40"/>
-                          <w:lang w:val="en-IN"/>
-                        </w:rPr>
-                        <w:t xml:space="preserve"> Science &amp; Application</w:t>
-                      </w:r>
-                    </w:p>
-                    <w:p>
-                      <w:pPr>
-                        <w:rPr>
-                          <w:sz w:val="40"/>
-                          <w:szCs w:val="40"/>
-                          <w:lang w:val="en-IN"/>
-                        </w:rPr>
-                      </w:pPr>
-                      <w:proofErr w:type="gramStart"/>
-                      <w:r>
-                        <w:rPr>
-                          <w:sz w:val="40"/>
-                          <w:szCs w:val="40"/>
-                          <w:lang w:val="en-IN"/>
-                        </w:rPr>
-                        <w:t>Semester :</w:t>
-                      </w:r>
-                      <w:proofErr w:type="gramEnd"/>
-                      <w:r>
-                        <w:rPr>
-                          <w:sz w:val="40"/>
-                          <w:szCs w:val="40"/>
-                          <w:lang w:val="en-IN"/>
-                        </w:rPr>
-                        <w:t xml:space="preserve"> 3</w:t>
-                      </w:r>
-                      <w:r>
-                        <w:rPr>
-                          <w:sz w:val="40"/>
-                          <w:szCs w:val="40"/>
-                          <w:vertAlign w:val="superscript"/>
-                          <w:lang w:val="en-IN"/>
-                        </w:rPr>
-                        <w:t>rd</w:t>
-                      </w:r>
-                      <w:r>
-                        <w:rPr>
-                          <w:sz w:val="40"/>
-                          <w:szCs w:val="40"/>
-                          <w:lang w:val="en-IN"/>
-                        </w:rPr>
-                        <w:t xml:space="preserve"> </w:t>
-                      </w:r>
-                    </w:p>
-                    <w:p>
-                      <w:pPr>
-                        <w:rPr>
-                          <w:sz w:val="40"/>
-                          <w:szCs w:val="40"/>
-                          <w:lang w:val="en-IN"/>
-                        </w:rPr>
-                      </w:pPr>
-                      <w:r>
-                        <w:rPr>
-                          <w:sz w:val="40"/>
-                          <w:szCs w:val="40"/>
-                          <w:lang w:val="en-IN"/>
-                        </w:rPr>
-                        <w:t xml:space="preserve">Academic </w:t>
-                      </w:r>
-                      <w:proofErr w:type="gramStart"/>
-                      <w:r>
-                        <w:rPr>
-                          <w:sz w:val="40"/>
-                          <w:szCs w:val="40"/>
-                          <w:lang w:val="en-IN"/>
-                        </w:rPr>
-                        <w:t>Session :</w:t>
-                      </w:r>
-                      <w:proofErr w:type="gramEnd"/>
-                      <w:r>
-                        <w:rPr>
-                          <w:sz w:val="40"/>
-                          <w:szCs w:val="40"/>
-                          <w:lang w:val="en-IN"/>
-                        </w:rPr>
-                        <w:t xml:space="preserve"> 2026-27</w:t>
-                      </w:r>
-                    </w:p>
-                    <w:p>
-                      <w:pPr>
-                        <w:rPr>
-                          <w:sz w:val="40"/>
-                          <w:szCs w:val="40"/>
-                          <w:lang w:val="en-IN"/>
-                        </w:rPr>
-                      </w:pPr>
-                      <w:r>
-                        <w:rPr>
-                          <w:sz w:val="40"/>
-                          <w:szCs w:val="40"/>
-                          <w:lang w:val="en-IN"/>
-                        </w:rPr>
-                        <w:t xml:space="preserve">Subject </w:t>
-                      </w:r>
-                      <w:proofErr w:type="gramStart"/>
-                      <w:r>
-                        <w:rPr>
-                          <w:sz w:val="40"/>
-                          <w:szCs w:val="40"/>
-                          <w:lang w:val="en-IN"/>
-                        </w:rPr>
-                        <w:t>Name :</w:t>
-                      </w:r>
-                      <w:proofErr w:type="gramEnd"/>
-                      <w:r>
-                        <w:rPr>
-                          <w:sz w:val="40"/>
-                          <w:szCs w:val="40"/>
-                          <w:lang w:val="en-IN"/>
-                        </w:rPr>
-                        <w:t xml:space="preserve"> Machine Learning Lab</w:t>
-                      </w:r>
-                    </w:p>
-                    <w:p>
-                      <w:pPr>
-                        <w:rPr>
-                          <w:sz w:val="40"/>
-                          <w:szCs w:val="40"/>
-                          <w:lang w:val="en-IN"/>
-                        </w:rPr>
-                      </w:pPr>
-                      <w:r>
-                        <w:rPr>
-                          <w:sz w:val="40"/>
-                          <w:szCs w:val="40"/>
-                          <w:lang w:val="en-IN"/>
-                        </w:rPr>
-                        <w:t xml:space="preserve">Subject </w:t>
-                      </w:r>
-                      <w:proofErr w:type="gramStart"/>
-                      <w:r>
-                        <w:rPr>
-                          <w:sz w:val="40"/>
-                          <w:szCs w:val="40"/>
-                          <w:lang w:val="en-IN"/>
-                        </w:rPr>
-                        <w:t>Code :</w:t>
-                      </w:r>
-                      <w:proofErr w:type="gramEnd"/>
-                      <w:r>
-                        <w:rPr>
-                          <w:sz w:val="40"/>
-                          <w:szCs w:val="40"/>
-                          <w:lang w:val="en-IN"/>
-                        </w:rPr>
-                        <w:t xml:space="preserve"> MCA201P</w:t>
-                      </w:r>
-                    </w:p>
-                  </w:txbxContent>
-                </v:textbox>
-              </v:roundrect>
-            </w:pict>
-          </mc:Fallback>
-        </mc:AlternateContent>
-      </w:r>
-    </w:p>
-    <w:p>
-      <w:pPr>
-        <w:pStyle w:val="BodyText"/>
-        <w:spacing w:before="211"/>
-      </w:pPr>
-    </w:p>
-    <w:p>
-      <w:pPr>
-        <w:pStyle w:val="BodyText"/>
-        <w:spacing w:before="211"/>
-      </w:pPr>
-    </w:p>
-    <w:p>
-      <w:pPr>
-        <w:pStyle w:val="BodyText"/>
-        <w:spacing w:before="211"/>
-      </w:pPr>
-    </w:p>
-    <w:p>
-      <w:pPr>
-        <w:pStyle w:val="BodyText"/>
-        <w:spacing w:before="211"/>
-      </w:pPr>
-    </w:p>
-    <w:p>
-      <w:pPr>
-        <w:pStyle w:val="BodyText"/>
-        <w:spacing w:before="211"/>
-      </w:pPr>
-    </w:p>
-    <w:p>
-      <w:pPr>
-        <w:pStyle w:val="BodyText"/>
-        <w:spacing w:before="211"/>
-      </w:pPr>
-    </w:p>
-    <w:p>
-      <w:pPr>
-        <w:pStyle w:val="BodyText"/>
-        <w:spacing w:before="211"/>
-      </w:pPr>
-    </w:p>
-    <w:p>
-      <w:pPr>
-        <w:pStyle w:val="BodyText"/>
-        <w:spacing w:before="211"/>
-      </w:pPr>
-    </w:p>
-    <w:p>
-      <w:pPr>
-        <w:pStyle w:val="BodyText"/>
-        <w:spacing w:before="211"/>
-      </w:pPr>
-    </w:p>
-    <w:p>
-      <w:pPr>
-        <w:pStyle w:val="BodyText"/>
-        <w:spacing w:before="211"/>
-      </w:pPr>
-    </w:p>
-    <w:p>
-      <w:pPr>
-        <w:pStyle w:val="BodyText"/>
-        <w:spacing w:before="188"/>
-        <w:rPr>
-          <w:sz w:val="34"/>
-        </w:rPr>
-      </w:pPr>
-    </w:p>
-    <w:p>
-      <w:pPr>
-        <w:pStyle w:val="BodyText"/>
-        <w:spacing w:before="1" w:line="417" w:lineRule="auto"/>
-        <w:ind w:left="820" w:right="756"/>
-        <w:jc w:val="center"/>
-      </w:pPr>
-      <w:r>
-        <w:t>7th</w:t>
-      </w:r>
-      <w:r>
-        <w:rPr>
-          <w:spacing w:val="-4"/>
-        </w:rPr>
-        <w:t xml:space="preserve"> </w:t>
-      </w:r>
-      <w:r>
-        <w:t>K.M.</w:t>
-      </w:r>
-      <w:r>
-        <w:rPr>
-          <w:spacing w:val="-4"/>
-        </w:rPr>
-        <w:t xml:space="preserve"> </w:t>
-      </w:r>
-      <w:r>
-        <w:t>on</w:t>
-      </w:r>
-      <w:r>
-        <w:rPr>
-          <w:spacing w:val="-4"/>
-        </w:rPr>
-        <w:t xml:space="preserve"> </w:t>
-      </w:r>
-      <w:r>
-        <w:t>Roorkee</w:t>
-      </w:r>
-      <w:r>
-        <w:rPr>
-          <w:spacing w:val="-4"/>
-        </w:rPr>
-        <w:t xml:space="preserve"> </w:t>
-      </w:r>
-      <w:r>
-        <w:t>Haridwar</w:t>
-      </w:r>
-      <w:r>
-        <w:rPr>
-          <w:spacing w:val="-4"/>
-        </w:rPr>
-        <w:t xml:space="preserve"> </w:t>
-      </w:r>
-      <w:r>
-        <w:t>Road</w:t>
-      </w:r>
-      <w:r>
-        <w:rPr>
-          <w:spacing w:val="-4"/>
-        </w:rPr>
-        <w:t xml:space="preserve"> </w:t>
-      </w:r>
-      <w:r>
-        <w:t>(NH-58),</w:t>
-      </w:r>
-      <w:r>
-        <w:rPr>
-          <w:spacing w:val="-4"/>
-        </w:rPr>
-        <w:t xml:space="preserve"> </w:t>
-      </w:r>
-      <w:r>
-        <w:t>Post</w:t>
-      </w:r>
-      <w:r>
-        <w:rPr>
-          <w:spacing w:val="-4"/>
-        </w:rPr>
-        <w:t xml:space="preserve"> </w:t>
-      </w:r>
-      <w:r>
-        <w:t>Box</w:t>
-      </w:r>
-      <w:r>
-        <w:rPr>
-          <w:spacing w:val="-4"/>
-        </w:rPr>
-        <w:t xml:space="preserve"> </w:t>
-      </w:r>
-      <w:r>
-        <w:t>No.</w:t>
-      </w:r>
-      <w:r>
-        <w:rPr>
-          <w:spacing w:val="-4"/>
-        </w:rPr>
-        <w:t xml:space="preserve"> </w:t>
-      </w:r>
-      <w:r>
-        <w:t>27,</w:t>
-      </w:r>
-      <w:r>
-        <w:rPr>
-          <w:spacing w:val="-4"/>
-        </w:rPr>
-        <w:t xml:space="preserve"> </w:t>
-      </w:r>
-      <w:proofErr w:type="spellStart"/>
-      <w:r>
-        <w:t>Vardhmanpuram</w:t>
-      </w:r>
-      <w:proofErr w:type="spellEnd"/>
-      <w:r>
-        <w:t>, Roorkee- 247667 District. Haridwar (Uttarakhand)</w:t>
-      </w:r>
-    </w:p>
-    <w:p>
-      <w:pPr>
-        <w:pStyle w:val="BodyText"/>
-        <w:spacing w:before="1"/>
-        <w:ind w:left="62"/>
-        <w:jc w:val="center"/>
-      </w:pPr>
-      <w:r>
-        <w:t>Website:</w:t>
-      </w:r>
-      <w:r>
-        <w:rPr>
-          <w:spacing w:val="-10"/>
-        </w:rPr>
-        <w:t xml:space="preserve"> </w:t>
-      </w:r>
-      <w:hyperlink r:id="rId9">
-        <w:r>
-          <w:rPr>
-            <w:spacing w:val="-2"/>
-          </w:rPr>
-          <w:t>www.coeruniversity.ac.in</w:t>
-        </w:r>
-      </w:hyperlink>
-    </w:p>
-    <w:p>
-      <w:pPr>
-        <w:pStyle w:val="BodyText"/>
-        <w:jc w:val="center"/>
-        <w:sectPr>
-          <w:headerReference w:type="default" r:id="rId10"/>
-          <w:type w:val="continuous"/>
-          <w:pgSz w:w="11920" w:h="16840"/>
-          <w:pgMar w:top="3900" w:right="992" w:bottom="280" w:left="1275" w:header="1470" w:footer="0" w:gutter="0"/>
-          <w:pgNumType w:start="1"/>
-          <w:cols w:space="720"/>
-        </w:sectPr>
-      </w:pPr>
-    </w:p>
-    <w:p>
-      <w:pPr>
-        <w:pStyle w:val="Heading1"/>
-      </w:pPr>
-      <w:r>
-        <w:rPr>
-          <w:spacing w:val="-2"/>
-        </w:rPr>
-        <w:lastRenderedPageBreak/>
-        <w:t>INDEX</w:t>
-      </w:r>
-    </w:p>
-    <w:p>
-      <w:pPr>
-        <w:pStyle w:val="Heading3"/>
-        <w:tabs>
-          <w:tab w:val="left" w:leader="dot" w:pos="5629"/>
-        </w:tabs>
-        <w:spacing w:before="203"/>
-        <w:jc w:val="both"/>
-      </w:pPr>
-      <w:r>
-        <w:t>Student</w:t>
-      </w:r>
-      <w:r>
-        <w:rPr>
-          <w:spacing w:val="-9"/>
-        </w:rPr>
-        <w:t xml:space="preserve"> </w:t>
-      </w:r>
-      <w:r>
-        <w:rPr>
-          <w:spacing w:val="-4"/>
-        </w:rPr>
-        <w:t>Name</w:t>
-      </w:r>
-      <w:r>
-        <w:rPr>
-          <w:rFonts w:ascii="Times New Roman"/>
-          <w:b w:val="0"/>
-        </w:rPr>
-        <w:t xml:space="preserve">: DHRUV   </w:t>
-      </w:r>
-      <w:r>
-        <w:t>Roll</w:t>
-      </w:r>
-      <w:r>
-        <w:rPr>
-          <w:spacing w:val="-11"/>
-        </w:rPr>
-        <w:t xml:space="preserve"> </w:t>
-      </w:r>
-      <w:r>
-        <w:rPr>
-          <w:spacing w:val="-5"/>
-        </w:rPr>
-        <w:t>No</w:t>
-      </w:r>
-      <w:r>
-        <w:rPr>
-          <w:spacing w:val="-5"/>
-        </w:rPr>
-        <w:t>: 253028030</w:t>
-      </w:r>
-    </w:p>
-    <w:p>
-      <w:pPr>
-        <w:pStyle w:val="Heading3"/>
-        <w:tabs>
-          <w:tab w:val="left" w:leader="dot" w:pos="5774"/>
-        </w:tabs>
-        <w:jc w:val="both"/>
-        <w:rPr>
-          <w:rFonts w:ascii="Times New Roman" w:hAnsi="Times New Roman" w:cs="Times New Roman"/>
-          <w:b w:val="0"/>
-          <w:bCs w:val="0"/>
-        </w:rPr>
-      </w:pPr>
-      <w:r>
-        <w:t>Sub</w:t>
-      </w:r>
-      <w:r>
-        <w:rPr>
-          <w:spacing w:val="-4"/>
-        </w:rPr>
-        <w:t xml:space="preserve"> </w:t>
-      </w:r>
-      <w:proofErr w:type="gramStart"/>
-      <w:r>
-        <w:t>Name</w:t>
-      </w:r>
-      <w:r>
-        <w:rPr>
-          <w:spacing w:val="-3"/>
-        </w:rPr>
-        <w:t xml:space="preserve"> </w:t>
-      </w:r>
-      <w:r>
-        <w:rPr>
-          <w:spacing w:val="-10"/>
-        </w:rPr>
-        <w:t>:</w:t>
-      </w:r>
-      <w:proofErr w:type="gramEnd"/>
-      <w:r>
-        <w:rPr>
-          <w:rFonts w:ascii="Times New Roman"/>
-          <w:b w:val="0"/>
-        </w:rPr>
-        <w:t xml:space="preserve"> Machine learning lab </w:t>
-      </w:r>
-      <w:proofErr w:type="gramStart"/>
-      <w:r>
-        <w:t>Code</w:t>
-      </w:r>
-      <w:r>
-        <w:rPr>
-          <w:spacing w:val="-4"/>
-        </w:rPr>
-        <w:t xml:space="preserve"> </w:t>
-      </w:r>
-      <w:r>
-        <w:rPr>
-          <w:spacing w:val="-10"/>
-        </w:rPr>
-        <w:t>:</w:t>
-      </w:r>
-      <w:proofErr w:type="gramEnd"/>
-      <w:r>
-        <w:rPr>
-          <w:spacing w:val="-10"/>
-        </w:rPr>
-        <w:t xml:space="preserve"> </w:t>
-      </w:r>
-      <w:r>
-        <w:rPr>
-          <w:rFonts w:ascii="Times New Roman" w:hAnsi="Times New Roman" w:cs="Times New Roman"/>
-          <w:b w:val="0"/>
-          <w:bCs w:val="0"/>
-          <w:spacing w:val="-10"/>
-        </w:rPr>
-        <w:t>MCA201P</w:t>
-      </w:r>
-    </w:p>
-    <w:p>
-      <w:pPr>
-        <w:pStyle w:val="Heading3"/>
-        <w:tabs>
-          <w:tab w:val="left" w:leader="dot" w:pos="7159"/>
-        </w:tabs>
-        <w:jc w:val="both"/>
-        <w:rPr>
-          <w:rFonts w:ascii="Times New Roman" w:hAnsi="Times New Roman" w:cs="Times New Roman"/>
-          <w:b w:val="0"/>
-          <w:bCs w:val="0"/>
-        </w:rPr>
-      </w:pPr>
-      <w:proofErr w:type="gramStart"/>
-      <w:r>
-        <w:t>Program</w:t>
-      </w:r>
-      <w:r>
-        <w:rPr>
-          <w:spacing w:val="-12"/>
-        </w:rPr>
-        <w:t xml:space="preserve"> </w:t>
-      </w:r>
-      <w:r>
-        <w:t>:</w:t>
-      </w:r>
-      <w:proofErr w:type="gramEnd"/>
-      <w:r>
-        <w:t xml:space="preserve"> </w:t>
-      </w:r>
-      <w:r>
-        <w:rPr>
-          <w:rFonts w:ascii="Times New Roman" w:hAnsi="Times New Roman" w:cs="Times New Roman"/>
-          <w:b w:val="0"/>
-          <w:bCs w:val="0"/>
-        </w:rPr>
-        <w:t>MCA</w:t>
-      </w:r>
-      <w:r>
-        <w:rPr>
-          <w:spacing w:val="62"/>
-          <w:w w:val="150"/>
-        </w:rPr>
-        <w:t xml:space="preserve"> </w:t>
-      </w:r>
-      <w:r>
-        <w:rPr>
-          <w:spacing w:val="-2"/>
-        </w:rPr>
-        <w:t>Semester:</w:t>
-      </w:r>
-      <w:r>
-        <w:rPr>
-          <w:spacing w:val="-2"/>
-        </w:rPr>
-        <w:t xml:space="preserve"> </w:t>
-      </w:r>
-      <w:r>
-        <w:rPr>
-          <w:rFonts w:ascii="Times New Roman" w:hAnsi="Times New Roman" w:cs="Times New Roman"/>
-          <w:b w:val="0"/>
-          <w:bCs w:val="0"/>
-          <w:spacing w:val="-2"/>
-        </w:rPr>
-        <w:t>3</w:t>
-      </w:r>
-      <w:r>
-        <w:rPr>
-          <w:rFonts w:ascii="Times New Roman" w:hAnsi="Times New Roman" w:cs="Times New Roman"/>
-          <w:b w:val="0"/>
-          <w:bCs w:val="0"/>
-          <w:spacing w:val="-2"/>
-          <w:vertAlign w:val="superscript"/>
-        </w:rPr>
-        <w:t>rd</w:t>
-      </w:r>
-      <w:r>
-        <w:rPr>
-          <w:rFonts w:ascii="Times New Roman" w:hAnsi="Times New Roman" w:cs="Times New Roman"/>
-          <w:b w:val="0"/>
-          <w:bCs w:val="0"/>
-          <w:spacing w:val="-2"/>
-        </w:rPr>
-        <w:t xml:space="preserve"> </w:t>
-      </w:r>
-      <w:r>
-        <w:rPr>
-          <w:rFonts w:ascii="Times New Roman" w:hAnsi="Times New Roman"/>
-          <w:b w:val="0"/>
-        </w:rPr>
-        <w:t xml:space="preserve"> </w:t>
-      </w:r>
-      <w:r>
-        <w:t xml:space="preserve"> </w:t>
-      </w:r>
-      <w:proofErr w:type="gramStart"/>
-      <w:r>
-        <w:t>Section</w:t>
-      </w:r>
-      <w:r>
-        <w:rPr>
-          <w:spacing w:val="-9"/>
-        </w:rPr>
-        <w:t xml:space="preserve"> </w:t>
-      </w:r>
-      <w:r>
-        <w:rPr>
-          <w:spacing w:val="-10"/>
-        </w:rPr>
-        <w:t>:</w:t>
-      </w:r>
-      <w:proofErr w:type="gramEnd"/>
-      <w:r>
-        <w:rPr>
-          <w:spacing w:val="-10"/>
-        </w:rPr>
-        <w:t xml:space="preserve"> </w:t>
-      </w:r>
-      <w:r>
-        <w:rPr>
-          <w:rFonts w:ascii="Times New Roman" w:hAnsi="Times New Roman" w:cs="Times New Roman"/>
-          <w:b w:val="0"/>
-          <w:bCs w:val="0"/>
-          <w:spacing w:val="-10"/>
-        </w:rPr>
-        <w:t>A</w:t>
-      </w:r>
-    </w:p>
-    <w:p>
-      <w:pPr>
-        <w:pStyle w:val="BodyText"/>
-        <w:spacing w:before="11"/>
-        <w:rPr>
-          <w:rFonts w:ascii="Calibri"/>
-          <w:sz w:val="13"/>
-        </w:rPr>
-      </w:pPr>
-    </w:p>
-    <w:tbl>
-      <w:tblPr>
-        <w:tblW w:w="0" w:type="auto"/>
-        <w:tblInd w:w="64" w:type="dxa"/>
-        <w:tblBorders>
-          <w:top w:val="single" w:sz="8" w:space="0" w:color="000000"/>
-          <w:left w:val="single" w:sz="8" w:space="0" w:color="000000"/>
-          <w:bottom w:val="single" w:sz="8" w:space="0" w:color="000000"/>
-          <w:right w:val="single" w:sz="8" w:space="0" w:color="000000"/>
-          <w:insideH w:val="single" w:sz="8" w:space="0" w:color="000000"/>
-          <w:insideV w:val="single" w:sz="8" w:space="0" w:color="000000"/>
-        </w:tblBorders>
-        <w:tblLayout w:type="fixed"/>
-        <w:tblCellMar>
-          <w:left w:w="0" w:type="dxa"/>
-          <w:right w:w="0" w:type="dxa"/>
-        </w:tblCellMar>
-        <w:tblLook w:val="01E0" w:firstRow="1" w:lastRow="1" w:firstColumn="1" w:lastColumn="1" w:noHBand="0" w:noVBand="0"/>
-      </w:tblPr>
-      <w:tblGrid>
-        <w:gridCol w:w="880"/>
-        <w:gridCol w:w="2120"/>
-        <w:gridCol w:w="1120"/>
-        <w:gridCol w:w="1480"/>
-        <w:gridCol w:w="1960"/>
-        <w:gridCol w:w="1760"/>
-      </w:tblGrid>
-      <w:tr>
-        <w:trPr>
-          <w:trHeight w:val="419"/>
-        </w:trPr>
-        <w:tc>
-          <w:tcPr>
-            <w:tcW w:w="880" w:type="dxa"/>
-          </w:tcPr>
-          <w:p>
-            <w:pPr>
-              <w:pStyle w:val="TableParagraph"/>
-              <w:spacing w:before="11"/>
-              <w:ind w:left="131"/>
-              <w:rPr>
-                <w:b/>
-                <w:sz w:val="28"/>
-              </w:rPr>
-            </w:pPr>
-            <w:proofErr w:type="spellStart"/>
-            <w:r>
-              <w:rPr>
-                <w:b/>
-                <w:spacing w:val="-2"/>
-                <w:sz w:val="28"/>
-              </w:rPr>
-              <w:t>S.No</w:t>
-            </w:r>
-            <w:proofErr w:type="spellEnd"/>
-            <w:r>
-              <w:rPr>
-                <w:b/>
-                <w:spacing w:val="-2"/>
-                <w:sz w:val="28"/>
-              </w:rPr>
-              <w:t>.</w:t>
-            </w:r>
-          </w:p>
-        </w:tc>
-        <w:tc>
-          <w:tcPr>
-            <w:tcW w:w="2120" w:type="dxa"/>
-          </w:tcPr>
-          <w:p>
-            <w:pPr>
-              <w:pStyle w:val="TableParagraph"/>
-              <w:spacing w:before="11"/>
-              <w:ind w:left="374"/>
-              <w:rPr>
-                <w:b/>
-                <w:sz w:val="28"/>
-              </w:rPr>
-            </w:pPr>
-            <w:r>
-              <w:rPr>
-                <w:b/>
-                <w:spacing w:val="-2"/>
-                <w:sz w:val="28"/>
-              </w:rPr>
-              <w:t>Assessment</w:t>
-            </w:r>
-          </w:p>
-        </w:tc>
-        <w:tc>
-          <w:tcPr>
-            <w:tcW w:w="1120" w:type="dxa"/>
-          </w:tcPr>
-          <w:p>
-            <w:pPr>
-              <w:pStyle w:val="TableParagraph"/>
-              <w:spacing w:before="11"/>
-              <w:ind w:left="286"/>
-              <w:rPr>
-                <w:b/>
-                <w:sz w:val="28"/>
-              </w:rPr>
-            </w:pPr>
-            <w:r>
-              <w:rPr>
-                <w:b/>
-                <w:spacing w:val="-4"/>
-                <w:sz w:val="28"/>
-              </w:rPr>
-              <w:t>Date</w:t>
-            </w:r>
-          </w:p>
-        </w:tc>
-        <w:tc>
-          <w:tcPr>
-            <w:tcW w:w="1480" w:type="dxa"/>
-          </w:tcPr>
-          <w:p>
-            <w:pPr>
-              <w:pStyle w:val="TableParagraph"/>
-              <w:spacing w:before="11"/>
-              <w:ind w:left="185"/>
-              <w:rPr>
-                <w:b/>
-                <w:sz w:val="28"/>
-              </w:rPr>
-            </w:pPr>
-            <w:r>
-              <w:rPr>
-                <w:b/>
-                <w:spacing w:val="-2"/>
-                <w:sz w:val="28"/>
-              </w:rPr>
-              <w:t>Signature</w:t>
-            </w:r>
-          </w:p>
-        </w:tc>
-        <w:tc>
-          <w:tcPr>
-            <w:tcW w:w="1960" w:type="dxa"/>
-          </w:tcPr>
-          <w:p>
-            <w:pPr>
-              <w:pStyle w:val="TableParagraph"/>
-              <w:spacing w:before="11"/>
-              <w:ind w:left="473"/>
-              <w:rPr>
-                <w:b/>
-                <w:sz w:val="28"/>
-              </w:rPr>
-            </w:pPr>
-            <w:r>
-              <w:rPr>
-                <w:b/>
-                <w:spacing w:val="-2"/>
-                <w:sz w:val="28"/>
-              </w:rPr>
-              <w:t>Remarks</w:t>
-            </w:r>
-          </w:p>
-        </w:tc>
-        <w:tc>
-          <w:tcPr>
-            <w:tcW w:w="1760" w:type="dxa"/>
-          </w:tcPr>
-          <w:p>
-            <w:pPr>
-              <w:pStyle w:val="TableParagraph"/>
-              <w:spacing w:before="11"/>
-              <w:ind w:left="251"/>
-              <w:rPr>
-                <w:b/>
-                <w:sz w:val="28"/>
-              </w:rPr>
-            </w:pPr>
-            <w:r>
-              <w:rPr>
-                <w:b/>
-                <w:sz w:val="28"/>
-              </w:rPr>
-              <w:t>Marks</w:t>
-            </w:r>
-            <w:r>
-              <w:rPr>
-                <w:b/>
-                <w:spacing w:val="-7"/>
-                <w:sz w:val="28"/>
-              </w:rPr>
-              <w:t xml:space="preserve"> </w:t>
-            </w:r>
-            <w:r>
-              <w:rPr>
-                <w:b/>
-                <w:spacing w:val="-4"/>
-                <w:sz w:val="28"/>
-              </w:rPr>
-              <w:t>(10)</w:t>
-            </w:r>
-          </w:p>
-        </w:tc>
-      </w:tr>
-      <w:tr>
-        <w:trPr>
-          <w:trHeight w:val="420"/>
-        </w:trPr>
-        <w:tc>
-          <w:tcPr>
-            <w:tcW w:w="880" w:type="dxa"/>
-          </w:tcPr>
-          <w:p>
-            <w:pPr>
-              <w:pStyle w:val="TableParagraph"/>
-              <w:jc w:val="center"/>
-              <w:rPr>
-                <w:rFonts w:ascii="Times New Roman"/>
-                <w:sz w:val="28"/>
-              </w:rPr>
-            </w:pPr>
-            <w:r>
-              <w:rPr>
-                <w:rFonts w:ascii="Times New Roman"/>
-                <w:sz w:val="28"/>
-              </w:rPr>
-              <w:t>1</w:t>
-            </w:r>
-          </w:p>
-        </w:tc>
-        <w:tc>
-          <w:tcPr>
-            <w:tcW w:w="2120" w:type="dxa"/>
-          </w:tcPr>
-          <w:p>
-            <w:pPr>
-              <w:pStyle w:val="TableParagraph"/>
-              <w:jc w:val="center"/>
-              <w:rPr>
-                <w:rFonts w:ascii="Times New Roman"/>
-                <w:sz w:val="28"/>
-              </w:rPr>
-            </w:pPr>
-            <w:r>
-              <w:rPr>
-                <w:rFonts w:ascii="Times New Roman"/>
-                <w:sz w:val="28"/>
-              </w:rPr>
-              <w:t>Lab sheet 0</w:t>
-            </w:r>
-          </w:p>
-        </w:tc>
-        <w:tc>
-          <w:tcPr>
-            <w:tcW w:w="1120" w:type="dxa"/>
-          </w:tcPr>
-          <w:p>
-            <w:pPr>
-              <w:pStyle w:val="TableParagraph"/>
-              <w:jc w:val="center"/>
-              <w:rPr>
-                <w:rFonts w:ascii="Times New Roman"/>
-                <w:sz w:val="28"/>
-              </w:rPr>
-            </w:pPr>
-            <w:r>
-              <w:rPr>
-                <w:rFonts w:ascii="Times New Roman"/>
-                <w:sz w:val="28"/>
-              </w:rPr>
-              <w:t>14-08-26</w:t>
-            </w:r>
-          </w:p>
-        </w:tc>
-        <w:tc>
-          <w:tcPr>
-            <w:tcW w:w="1480" w:type="dxa"/>
-          </w:tcPr>
-          <w:p>
-            <w:pPr>
-              <w:pStyle w:val="TableParagraph"/>
-              <w:rPr>
-                <w:rFonts w:ascii="Times New Roman"/>
-                <w:sz w:val="28"/>
-              </w:rPr>
-            </w:pPr>
-          </w:p>
-        </w:tc>
-        <w:tc>
-          <w:tcPr>
-            <w:tcW w:w="1960" w:type="dxa"/>
-          </w:tcPr>
-          <w:p>
-            <w:pPr>
-              <w:pStyle w:val="TableParagraph"/>
-              <w:rPr>
-                <w:rFonts w:ascii="Times New Roman"/>
-                <w:sz w:val="28"/>
-              </w:rPr>
-            </w:pPr>
-          </w:p>
-        </w:tc>
-        <w:tc>
-          <w:tcPr>
-            <w:tcW w:w="1760" w:type="dxa"/>
-          </w:tcPr>
-          <w:p>
-            <w:pPr>
-              <w:pStyle w:val="TableParagraph"/>
-              <w:rPr>
-                <w:rFonts w:ascii="Times New Roman"/>
-                <w:sz w:val="28"/>
-              </w:rPr>
-            </w:pPr>
-          </w:p>
-        </w:tc>
-      </w:tr>
-      <w:tr>
-        <w:trPr>
-          <w:trHeight w:val="399"/>
-        </w:trPr>
-        <w:tc>
-          <w:tcPr>
-            <w:tcW w:w="880" w:type="dxa"/>
-          </w:tcPr>
-          <w:p>
-            <w:pPr>
-              <w:pStyle w:val="TableParagraph"/>
-              <w:jc w:val="center"/>
-              <w:rPr>
-                <w:rFonts w:ascii="Times New Roman"/>
-                <w:sz w:val="28"/>
-              </w:rPr>
-            </w:pPr>
-            <w:r>
-              <w:rPr>
-                <w:rFonts w:ascii="Times New Roman"/>
-                <w:sz w:val="28"/>
-              </w:rPr>
-              <w:t>2</w:t>
-            </w:r>
-          </w:p>
-        </w:tc>
-        <w:tc>
-          <w:tcPr>
-            <w:tcW w:w="2120" w:type="dxa"/>
-          </w:tcPr>
-          <w:p>
-            <w:pPr>
-              <w:pStyle w:val="TableParagraph"/>
-              <w:jc w:val="center"/>
-              <w:rPr>
-                <w:rFonts w:ascii="Times New Roman"/>
-                <w:sz w:val="28"/>
-              </w:rPr>
-            </w:pPr>
-            <w:r>
-              <w:rPr>
-                <w:rFonts w:ascii="Times New Roman"/>
-                <w:sz w:val="28"/>
-              </w:rPr>
-              <w:t>Lab sheet 1</w:t>
-            </w:r>
-          </w:p>
-        </w:tc>
-        <w:tc>
-          <w:tcPr>
-            <w:tcW w:w="1120" w:type="dxa"/>
-          </w:tcPr>
-          <w:p>
-            <w:pPr>
-              <w:pStyle w:val="TableParagraph"/>
-              <w:jc w:val="center"/>
-              <w:rPr>
-                <w:rFonts w:ascii="Times New Roman"/>
-                <w:sz w:val="28"/>
-              </w:rPr>
-            </w:pPr>
-            <w:r>
-              <w:rPr>
-                <w:rFonts w:ascii="Times New Roman"/>
-                <w:sz w:val="28"/>
-              </w:rPr>
-              <w:t>14-08-26</w:t>
-            </w:r>
-          </w:p>
-        </w:tc>
-        <w:tc>
-          <w:tcPr>
-            <w:tcW w:w="1480" w:type="dxa"/>
-          </w:tcPr>
-          <w:p>
-            <w:pPr>
-              <w:pStyle w:val="TableParagraph"/>
-              <w:rPr>
-                <w:rFonts w:ascii="Times New Roman"/>
-                <w:sz w:val="28"/>
-              </w:rPr>
-            </w:pPr>
-          </w:p>
-        </w:tc>
-        <w:tc>
-          <w:tcPr>
-            <w:tcW w:w="1960" w:type="dxa"/>
-          </w:tcPr>
-          <w:p>
-            <w:pPr>
-              <w:pStyle w:val="TableParagraph"/>
-              <w:rPr>
-                <w:rFonts w:ascii="Times New Roman"/>
-                <w:sz w:val="28"/>
-              </w:rPr>
-            </w:pPr>
-          </w:p>
-        </w:tc>
-        <w:tc>
-          <w:tcPr>
-            <w:tcW w:w="1760" w:type="dxa"/>
-          </w:tcPr>
-          <w:p>
-            <w:pPr>
-              <w:pStyle w:val="TableParagraph"/>
-              <w:rPr>
-                <w:rFonts w:ascii="Times New Roman"/>
-                <w:sz w:val="28"/>
-              </w:rPr>
-            </w:pPr>
-          </w:p>
-        </w:tc>
-      </w:tr>
-      <w:tr>
-        <w:trPr>
-          <w:trHeight w:val="420"/>
-        </w:trPr>
-        <w:tc>
-          <w:tcPr>
-            <w:tcW w:w="880" w:type="dxa"/>
-          </w:tcPr>
-          <w:p>
-            <w:pPr>
-              <w:pStyle w:val="TableParagraph"/>
-              <w:rPr>
-                <w:rFonts w:ascii="Times New Roman"/>
-                <w:sz w:val="28"/>
-              </w:rPr>
-            </w:pPr>
-          </w:p>
-        </w:tc>
-        <w:tc>
-          <w:tcPr>
-            <w:tcW w:w="2120" w:type="dxa"/>
-          </w:tcPr>
-          <w:p>
-            <w:pPr>
-              <w:pStyle w:val="TableParagraph"/>
-              <w:rPr>
-                <w:rFonts w:ascii="Times New Roman"/>
-                <w:sz w:val="28"/>
-              </w:rPr>
-            </w:pPr>
-          </w:p>
-        </w:tc>
-        <w:tc>
-          <w:tcPr>
-            <w:tcW w:w="1120" w:type="dxa"/>
-          </w:tcPr>
-          <w:p>
-            <w:pPr>
-              <w:pStyle w:val="TableParagraph"/>
-              <w:rPr>
-                <w:rFonts w:ascii="Times New Roman"/>
-                <w:sz w:val="28"/>
-              </w:rPr>
-            </w:pPr>
-          </w:p>
-        </w:tc>
-        <w:tc>
-          <w:tcPr>
-            <w:tcW w:w="1480" w:type="dxa"/>
-          </w:tcPr>
-          <w:p>
-            <w:pPr>
-              <w:pStyle w:val="TableParagraph"/>
-              <w:rPr>
-                <w:rFonts w:ascii="Times New Roman"/>
-                <w:sz w:val="28"/>
-              </w:rPr>
-            </w:pPr>
-          </w:p>
-        </w:tc>
-        <w:tc>
-          <w:tcPr>
-            <w:tcW w:w="1960" w:type="dxa"/>
-          </w:tcPr>
-          <w:p>
-            <w:pPr>
-              <w:pStyle w:val="TableParagraph"/>
-              <w:rPr>
-                <w:rFonts w:ascii="Times New Roman"/>
-                <w:sz w:val="28"/>
-              </w:rPr>
-            </w:pPr>
-          </w:p>
-        </w:tc>
-        <w:tc>
-          <w:tcPr>
-            <w:tcW w:w="1760" w:type="dxa"/>
-          </w:tcPr>
-          <w:p>
-            <w:pPr>
-              <w:pStyle w:val="TableParagraph"/>
-              <w:rPr>
-                <w:rFonts w:ascii="Times New Roman"/>
-                <w:sz w:val="28"/>
-              </w:rPr>
-            </w:pPr>
-          </w:p>
-        </w:tc>
-      </w:tr>
-      <w:tr>
-        <w:trPr>
-          <w:trHeight w:val="420"/>
-        </w:trPr>
-        <w:tc>
-          <w:tcPr>
-            <w:tcW w:w="880" w:type="dxa"/>
-          </w:tcPr>
-          <w:p>
-            <w:pPr>
-              <w:pStyle w:val="TableParagraph"/>
-              <w:rPr>
-                <w:rFonts w:ascii="Times New Roman"/>
-                <w:sz w:val="28"/>
-              </w:rPr>
-            </w:pPr>
-          </w:p>
-        </w:tc>
-        <w:tc>
-          <w:tcPr>
-            <w:tcW w:w="2120" w:type="dxa"/>
-          </w:tcPr>
-          <w:p>
-            <w:pPr>
-              <w:pStyle w:val="TableParagraph"/>
-              <w:rPr>
-                <w:rFonts w:ascii="Times New Roman"/>
-                <w:sz w:val="28"/>
-              </w:rPr>
-            </w:pPr>
-          </w:p>
-        </w:tc>
-        <w:tc>
-          <w:tcPr>
-            <w:tcW w:w="1120" w:type="dxa"/>
-          </w:tcPr>
-          <w:p>
-            <w:pPr>
-              <w:pStyle w:val="TableParagraph"/>
-              <w:rPr>
-                <w:rFonts w:ascii="Times New Roman"/>
-                <w:sz w:val="28"/>
-              </w:rPr>
-            </w:pPr>
-          </w:p>
-        </w:tc>
-        <w:tc>
-          <w:tcPr>
-            <w:tcW w:w="1480" w:type="dxa"/>
-          </w:tcPr>
-          <w:p>
-            <w:pPr>
-              <w:pStyle w:val="TableParagraph"/>
-              <w:rPr>
-                <w:rFonts w:ascii="Times New Roman"/>
-                <w:sz w:val="28"/>
-              </w:rPr>
-            </w:pPr>
-          </w:p>
-        </w:tc>
-        <w:tc>
-          <w:tcPr>
-            <w:tcW w:w="1960" w:type="dxa"/>
-          </w:tcPr>
-          <w:p>
-            <w:pPr>
-              <w:pStyle w:val="TableParagraph"/>
-              <w:rPr>
-                <w:rFonts w:ascii="Times New Roman"/>
-                <w:sz w:val="28"/>
-              </w:rPr>
-            </w:pPr>
-          </w:p>
-        </w:tc>
-        <w:tc>
-          <w:tcPr>
-            <w:tcW w:w="1760" w:type="dxa"/>
-          </w:tcPr>
-          <w:p>
-            <w:pPr>
-              <w:pStyle w:val="TableParagraph"/>
-              <w:rPr>
-                <w:rFonts w:ascii="Times New Roman"/>
-                <w:sz w:val="28"/>
-              </w:rPr>
-            </w:pPr>
-          </w:p>
-        </w:tc>
-      </w:tr>
-      <w:tr>
-        <w:trPr>
-          <w:trHeight w:val="419"/>
-        </w:trPr>
-        <w:tc>
-          <w:tcPr>
-            <w:tcW w:w="880" w:type="dxa"/>
-          </w:tcPr>
-          <w:p>
-            <w:pPr>
-              <w:pStyle w:val="TableParagraph"/>
-              <w:rPr>
-                <w:rFonts w:ascii="Times New Roman"/>
-                <w:sz w:val="28"/>
-              </w:rPr>
-            </w:pPr>
-          </w:p>
-        </w:tc>
-        <w:tc>
-          <w:tcPr>
-            <w:tcW w:w="2120" w:type="dxa"/>
-          </w:tcPr>
-          <w:p>
-            <w:pPr>
-              <w:pStyle w:val="TableParagraph"/>
-              <w:rPr>
-                <w:rFonts w:ascii="Times New Roman"/>
-                <w:sz w:val="28"/>
-              </w:rPr>
-            </w:pPr>
-          </w:p>
-        </w:tc>
-        <w:tc>
-          <w:tcPr>
-            <w:tcW w:w="1120" w:type="dxa"/>
-          </w:tcPr>
-          <w:p>
-            <w:pPr>
-              <w:pStyle w:val="TableParagraph"/>
-              <w:rPr>
-                <w:rFonts w:ascii="Times New Roman"/>
-                <w:sz w:val="28"/>
-              </w:rPr>
-            </w:pPr>
-          </w:p>
-        </w:tc>
-        <w:tc>
-          <w:tcPr>
-            <w:tcW w:w="1480" w:type="dxa"/>
-          </w:tcPr>
-          <w:p>
-            <w:pPr>
-              <w:pStyle w:val="TableParagraph"/>
-              <w:rPr>
-                <w:rFonts w:ascii="Times New Roman"/>
-                <w:sz w:val="28"/>
-              </w:rPr>
-            </w:pPr>
-          </w:p>
-        </w:tc>
-        <w:tc>
-          <w:tcPr>
-            <w:tcW w:w="1960" w:type="dxa"/>
-          </w:tcPr>
-          <w:p>
-            <w:pPr>
-              <w:pStyle w:val="TableParagraph"/>
-              <w:rPr>
-                <w:rFonts w:ascii="Times New Roman"/>
-                <w:sz w:val="28"/>
-              </w:rPr>
-            </w:pPr>
-          </w:p>
-        </w:tc>
-        <w:tc>
-          <w:tcPr>
-            <w:tcW w:w="1760" w:type="dxa"/>
-          </w:tcPr>
-          <w:p>
-            <w:pPr>
-              <w:pStyle w:val="TableParagraph"/>
-              <w:rPr>
-                <w:rFonts w:ascii="Times New Roman"/>
-                <w:sz w:val="28"/>
-              </w:rPr>
-            </w:pPr>
-          </w:p>
-        </w:tc>
-      </w:tr>
-      <w:tr>
-        <w:trPr>
-          <w:trHeight w:val="400"/>
-        </w:trPr>
-        <w:tc>
-          <w:tcPr>
-            <w:tcW w:w="880" w:type="dxa"/>
-          </w:tcPr>
-          <w:p>
-            <w:pPr>
-              <w:pStyle w:val="TableParagraph"/>
-              <w:rPr>
-                <w:rFonts w:ascii="Times New Roman"/>
-                <w:sz w:val="28"/>
-              </w:rPr>
-            </w:pPr>
-          </w:p>
-        </w:tc>
-        <w:tc>
-          <w:tcPr>
-            <w:tcW w:w="2120" w:type="dxa"/>
-          </w:tcPr>
-          <w:p>
-            <w:pPr>
-              <w:pStyle w:val="TableParagraph"/>
-              <w:rPr>
-                <w:rFonts w:ascii="Times New Roman"/>
-                <w:sz w:val="28"/>
-              </w:rPr>
-            </w:pPr>
-          </w:p>
-        </w:tc>
-        <w:tc>
-          <w:tcPr>
-            <w:tcW w:w="1120" w:type="dxa"/>
-          </w:tcPr>
-          <w:p>
-            <w:pPr>
-              <w:pStyle w:val="TableParagraph"/>
-              <w:rPr>
-                <w:rFonts w:ascii="Times New Roman"/>
-                <w:sz w:val="28"/>
-              </w:rPr>
-            </w:pPr>
-          </w:p>
-        </w:tc>
-        <w:tc>
-          <w:tcPr>
-            <w:tcW w:w="1480" w:type="dxa"/>
-          </w:tcPr>
-          <w:p>
-            <w:pPr>
-              <w:pStyle w:val="TableParagraph"/>
-              <w:rPr>
-                <w:rFonts w:ascii="Times New Roman"/>
-                <w:sz w:val="28"/>
-              </w:rPr>
-            </w:pPr>
-          </w:p>
-        </w:tc>
-        <w:tc>
-          <w:tcPr>
-            <w:tcW w:w="1960" w:type="dxa"/>
-          </w:tcPr>
-          <w:p>
-            <w:pPr>
-              <w:pStyle w:val="TableParagraph"/>
-              <w:rPr>
-                <w:rFonts w:ascii="Times New Roman"/>
-                <w:sz w:val="28"/>
-              </w:rPr>
-            </w:pPr>
-          </w:p>
-        </w:tc>
-        <w:tc>
-          <w:tcPr>
-            <w:tcW w:w="1760" w:type="dxa"/>
-          </w:tcPr>
-          <w:p>
-            <w:pPr>
-              <w:pStyle w:val="TableParagraph"/>
-              <w:rPr>
-                <w:rFonts w:ascii="Times New Roman"/>
-                <w:sz w:val="28"/>
-              </w:rPr>
-            </w:pPr>
-          </w:p>
-        </w:tc>
-      </w:tr>
-      <w:tr>
-        <w:trPr>
-          <w:trHeight w:val="400"/>
-        </w:trPr>
-        <w:tc>
-          <w:tcPr>
-            <w:tcW w:w="880" w:type="dxa"/>
-          </w:tcPr>
-          <w:p>
-            <w:pPr>
-              <w:pStyle w:val="TableParagraph"/>
-              <w:rPr>
-                <w:rFonts w:ascii="Times New Roman"/>
-                <w:sz w:val="28"/>
-              </w:rPr>
-            </w:pPr>
-          </w:p>
-        </w:tc>
-        <w:tc>
-          <w:tcPr>
-            <w:tcW w:w="2120" w:type="dxa"/>
-          </w:tcPr>
-          <w:p>
-            <w:pPr>
-              <w:pStyle w:val="TableParagraph"/>
-              <w:rPr>
-                <w:rFonts w:ascii="Times New Roman"/>
-                <w:sz w:val="28"/>
-              </w:rPr>
-            </w:pPr>
-          </w:p>
-        </w:tc>
-        <w:tc>
-          <w:tcPr>
-            <w:tcW w:w="1120" w:type="dxa"/>
-          </w:tcPr>
-          <w:p>
-            <w:pPr>
-              <w:pStyle w:val="TableParagraph"/>
-              <w:rPr>
-                <w:rFonts w:ascii="Times New Roman"/>
-                <w:sz w:val="28"/>
-              </w:rPr>
-            </w:pPr>
-          </w:p>
-        </w:tc>
-        <w:tc>
-          <w:tcPr>
-            <w:tcW w:w="1480" w:type="dxa"/>
-          </w:tcPr>
-          <w:p>
-            <w:pPr>
-              <w:pStyle w:val="TableParagraph"/>
-              <w:rPr>
-                <w:rFonts w:ascii="Times New Roman"/>
-                <w:sz w:val="28"/>
-              </w:rPr>
-            </w:pPr>
-          </w:p>
-        </w:tc>
-        <w:tc>
-          <w:tcPr>
-            <w:tcW w:w="1960" w:type="dxa"/>
-          </w:tcPr>
-          <w:p>
-            <w:pPr>
-              <w:pStyle w:val="TableParagraph"/>
-              <w:rPr>
-                <w:rFonts w:ascii="Times New Roman"/>
-                <w:sz w:val="28"/>
-              </w:rPr>
-            </w:pPr>
-          </w:p>
-        </w:tc>
-        <w:tc>
-          <w:tcPr>
-            <w:tcW w:w="1760" w:type="dxa"/>
-          </w:tcPr>
-          <w:p>
-            <w:pPr>
-              <w:pStyle w:val="TableParagraph"/>
-              <w:rPr>
-                <w:rFonts w:ascii="Times New Roman"/>
-                <w:sz w:val="28"/>
-              </w:rPr>
-            </w:pPr>
-          </w:p>
-        </w:tc>
-      </w:tr>
-      <w:tr>
-        <w:trPr>
-          <w:trHeight w:val="400"/>
-        </w:trPr>
-        <w:tc>
-          <w:tcPr>
-            <w:tcW w:w="880" w:type="dxa"/>
-          </w:tcPr>
-          <w:p>
-            <w:pPr>
-              <w:pStyle w:val="TableParagraph"/>
-              <w:rPr>
-                <w:rFonts w:ascii="Times New Roman"/>
-                <w:sz w:val="28"/>
-              </w:rPr>
-            </w:pPr>
-          </w:p>
-        </w:tc>
-        <w:tc>
-          <w:tcPr>
-            <w:tcW w:w="2120" w:type="dxa"/>
-          </w:tcPr>
-          <w:p>
-            <w:pPr>
-              <w:pStyle w:val="TableParagraph"/>
-              <w:rPr>
-                <w:rFonts w:ascii="Times New Roman"/>
-                <w:sz w:val="28"/>
-              </w:rPr>
-            </w:pPr>
-          </w:p>
-        </w:tc>
-        <w:tc>
-          <w:tcPr>
-            <w:tcW w:w="1120" w:type="dxa"/>
-          </w:tcPr>
-          <w:p>
-            <w:pPr>
-              <w:pStyle w:val="TableParagraph"/>
-              <w:rPr>
-                <w:rFonts w:ascii="Times New Roman"/>
-                <w:sz w:val="28"/>
-              </w:rPr>
-            </w:pPr>
-          </w:p>
-        </w:tc>
-        <w:tc>
-          <w:tcPr>
-            <w:tcW w:w="1480" w:type="dxa"/>
-          </w:tcPr>
-          <w:p>
-            <w:pPr>
-              <w:pStyle w:val="TableParagraph"/>
-              <w:rPr>
-                <w:rFonts w:ascii="Times New Roman"/>
-                <w:sz w:val="28"/>
-              </w:rPr>
-            </w:pPr>
-          </w:p>
-        </w:tc>
-        <w:tc>
-          <w:tcPr>
-            <w:tcW w:w="1960" w:type="dxa"/>
-          </w:tcPr>
-          <w:p>
-            <w:pPr>
-              <w:pStyle w:val="TableParagraph"/>
-              <w:rPr>
-                <w:rFonts w:ascii="Times New Roman"/>
-                <w:sz w:val="28"/>
-              </w:rPr>
-            </w:pPr>
-          </w:p>
-        </w:tc>
-        <w:tc>
-          <w:tcPr>
-            <w:tcW w:w="1760" w:type="dxa"/>
-          </w:tcPr>
-          <w:p>
-            <w:pPr>
-              <w:pStyle w:val="TableParagraph"/>
-              <w:rPr>
-                <w:rFonts w:ascii="Times New Roman"/>
-                <w:sz w:val="28"/>
-              </w:rPr>
-            </w:pPr>
-          </w:p>
-        </w:tc>
-      </w:tr>
-      <w:tr>
-        <w:trPr>
-          <w:trHeight w:val="400"/>
-        </w:trPr>
-        <w:tc>
-          <w:tcPr>
-            <w:tcW w:w="880" w:type="dxa"/>
-          </w:tcPr>
-          <w:p>
-            <w:pPr>
-              <w:pStyle w:val="TableParagraph"/>
-              <w:rPr>
-                <w:rFonts w:ascii="Times New Roman"/>
-                <w:sz w:val="28"/>
-              </w:rPr>
-            </w:pPr>
-          </w:p>
-        </w:tc>
-        <w:tc>
-          <w:tcPr>
-            <w:tcW w:w="2120" w:type="dxa"/>
-          </w:tcPr>
-          <w:p>
-            <w:pPr>
-              <w:pStyle w:val="TableParagraph"/>
-              <w:rPr>
-                <w:rFonts w:ascii="Times New Roman"/>
-                <w:sz w:val="28"/>
-              </w:rPr>
-            </w:pPr>
-          </w:p>
-        </w:tc>
-        <w:tc>
-          <w:tcPr>
-            <w:tcW w:w="1120" w:type="dxa"/>
-          </w:tcPr>
-          <w:p>
-            <w:pPr>
-              <w:pStyle w:val="TableParagraph"/>
-              <w:rPr>
-                <w:rFonts w:ascii="Times New Roman"/>
-                <w:sz w:val="28"/>
-              </w:rPr>
-            </w:pPr>
-          </w:p>
-        </w:tc>
-        <w:tc>
-          <w:tcPr>
-            <w:tcW w:w="1480" w:type="dxa"/>
-          </w:tcPr>
-          <w:p>
-            <w:pPr>
-              <w:pStyle w:val="TableParagraph"/>
-              <w:rPr>
-                <w:rFonts w:ascii="Times New Roman"/>
-                <w:sz w:val="28"/>
-              </w:rPr>
-            </w:pPr>
-          </w:p>
-        </w:tc>
-        <w:tc>
-          <w:tcPr>
-            <w:tcW w:w="1960" w:type="dxa"/>
-          </w:tcPr>
-          <w:p>
-            <w:pPr>
-              <w:pStyle w:val="TableParagraph"/>
-              <w:rPr>
-                <w:rFonts w:ascii="Times New Roman"/>
-                <w:sz w:val="28"/>
-              </w:rPr>
-            </w:pPr>
-          </w:p>
-        </w:tc>
-        <w:tc>
-          <w:tcPr>
-            <w:tcW w:w="1760" w:type="dxa"/>
-          </w:tcPr>
-          <w:p>
-            <w:pPr>
-              <w:pStyle w:val="TableParagraph"/>
-              <w:rPr>
-                <w:rFonts w:ascii="Times New Roman"/>
-                <w:sz w:val="28"/>
-              </w:rPr>
-            </w:pPr>
-          </w:p>
-        </w:tc>
-      </w:tr>
-      <w:tr>
-        <w:trPr>
-          <w:trHeight w:val="400"/>
-        </w:trPr>
-        <w:tc>
-          <w:tcPr>
-            <w:tcW w:w="880" w:type="dxa"/>
-          </w:tcPr>
-          <w:p>
-            <w:pPr>
-              <w:pStyle w:val="TableParagraph"/>
-              <w:rPr>
-                <w:rFonts w:ascii="Times New Roman"/>
-                <w:sz w:val="28"/>
-              </w:rPr>
-            </w:pPr>
-          </w:p>
-        </w:tc>
-        <w:tc>
-          <w:tcPr>
-            <w:tcW w:w="2120" w:type="dxa"/>
-          </w:tcPr>
-          <w:p>
-            <w:pPr>
-              <w:pStyle w:val="TableParagraph"/>
-              <w:rPr>
-                <w:rFonts w:ascii="Times New Roman"/>
-                <w:sz w:val="28"/>
-              </w:rPr>
-            </w:pPr>
-          </w:p>
-        </w:tc>
-        <w:tc>
-          <w:tcPr>
-            <w:tcW w:w="1120" w:type="dxa"/>
-          </w:tcPr>
-          <w:p>
-            <w:pPr>
-              <w:pStyle w:val="TableParagraph"/>
-              <w:rPr>
-                <w:rFonts w:ascii="Times New Roman"/>
-                <w:sz w:val="28"/>
-              </w:rPr>
-            </w:pPr>
-          </w:p>
-        </w:tc>
-        <w:tc>
-          <w:tcPr>
-            <w:tcW w:w="1480" w:type="dxa"/>
-          </w:tcPr>
-          <w:p>
-            <w:pPr>
-              <w:pStyle w:val="TableParagraph"/>
-              <w:rPr>
-                <w:rFonts w:ascii="Times New Roman"/>
-                <w:sz w:val="28"/>
-              </w:rPr>
-            </w:pPr>
-          </w:p>
-        </w:tc>
-        <w:tc>
-          <w:tcPr>
-            <w:tcW w:w="1960" w:type="dxa"/>
-          </w:tcPr>
-          <w:p>
-            <w:pPr>
-              <w:pStyle w:val="TableParagraph"/>
-              <w:rPr>
-                <w:rFonts w:ascii="Times New Roman"/>
-                <w:sz w:val="28"/>
-              </w:rPr>
-            </w:pPr>
-          </w:p>
-        </w:tc>
-        <w:tc>
-          <w:tcPr>
-            <w:tcW w:w="1760" w:type="dxa"/>
-          </w:tcPr>
-          <w:p>
-            <w:pPr>
-              <w:pStyle w:val="TableParagraph"/>
-              <w:rPr>
-                <w:rFonts w:ascii="Times New Roman"/>
-                <w:sz w:val="28"/>
-              </w:rPr>
-            </w:pPr>
-          </w:p>
-        </w:tc>
-      </w:tr>
-      <w:tr>
-        <w:trPr>
-          <w:trHeight w:val="400"/>
-        </w:trPr>
-        <w:tc>
-          <w:tcPr>
-            <w:tcW w:w="880" w:type="dxa"/>
-          </w:tcPr>
-          <w:p>
-            <w:pPr>
-              <w:pStyle w:val="TableParagraph"/>
-              <w:rPr>
-                <w:rFonts w:ascii="Times New Roman"/>
-                <w:sz w:val="28"/>
-              </w:rPr>
-            </w:pPr>
-          </w:p>
-        </w:tc>
-        <w:tc>
-          <w:tcPr>
-            <w:tcW w:w="2120" w:type="dxa"/>
-          </w:tcPr>
-          <w:p>
-            <w:pPr>
-              <w:pStyle w:val="TableParagraph"/>
-              <w:rPr>
-                <w:rFonts w:ascii="Times New Roman"/>
-                <w:sz w:val="28"/>
-              </w:rPr>
-            </w:pPr>
-          </w:p>
-        </w:tc>
-        <w:tc>
-          <w:tcPr>
-            <w:tcW w:w="1120" w:type="dxa"/>
-          </w:tcPr>
-          <w:p>
-            <w:pPr>
-              <w:pStyle w:val="TableParagraph"/>
-              <w:rPr>
-                <w:rFonts w:ascii="Times New Roman"/>
-                <w:sz w:val="28"/>
-              </w:rPr>
-            </w:pPr>
-          </w:p>
-        </w:tc>
-        <w:tc>
-          <w:tcPr>
-            <w:tcW w:w="1480" w:type="dxa"/>
-          </w:tcPr>
-          <w:p>
-            <w:pPr>
-              <w:pStyle w:val="TableParagraph"/>
-              <w:rPr>
-                <w:rFonts w:ascii="Times New Roman"/>
-                <w:sz w:val="28"/>
-              </w:rPr>
-            </w:pPr>
-          </w:p>
-        </w:tc>
-        <w:tc>
-          <w:tcPr>
-            <w:tcW w:w="1960" w:type="dxa"/>
-          </w:tcPr>
-          <w:p>
-            <w:pPr>
-              <w:pStyle w:val="TableParagraph"/>
-              <w:rPr>
-                <w:rFonts w:ascii="Times New Roman"/>
-                <w:sz w:val="28"/>
-              </w:rPr>
-            </w:pPr>
-          </w:p>
-        </w:tc>
-        <w:tc>
-          <w:tcPr>
-            <w:tcW w:w="1760" w:type="dxa"/>
-          </w:tcPr>
-          <w:p>
-            <w:pPr>
-              <w:pStyle w:val="TableParagraph"/>
-              <w:rPr>
-                <w:rFonts w:ascii="Times New Roman"/>
-                <w:sz w:val="28"/>
-              </w:rPr>
-            </w:pPr>
-          </w:p>
-        </w:tc>
-      </w:tr>
-      <w:tr>
-        <w:trPr>
-          <w:trHeight w:val="400"/>
-        </w:trPr>
-        <w:tc>
-          <w:tcPr>
-            <w:tcW w:w="880" w:type="dxa"/>
-          </w:tcPr>
-          <w:p>
-            <w:pPr>
-              <w:pStyle w:val="TableParagraph"/>
-              <w:rPr>
-                <w:rFonts w:ascii="Times New Roman"/>
-                <w:sz w:val="28"/>
-              </w:rPr>
-            </w:pPr>
-          </w:p>
-        </w:tc>
-        <w:tc>
-          <w:tcPr>
-            <w:tcW w:w="2120" w:type="dxa"/>
-          </w:tcPr>
-          <w:p>
-            <w:pPr>
-              <w:pStyle w:val="TableParagraph"/>
-              <w:rPr>
-                <w:rFonts w:ascii="Times New Roman"/>
-                <w:sz w:val="28"/>
-              </w:rPr>
-            </w:pPr>
-          </w:p>
-        </w:tc>
-        <w:tc>
-          <w:tcPr>
-            <w:tcW w:w="1120" w:type="dxa"/>
-          </w:tcPr>
-          <w:p>
-            <w:pPr>
-              <w:pStyle w:val="TableParagraph"/>
-              <w:rPr>
-                <w:rFonts w:ascii="Times New Roman"/>
-                <w:sz w:val="28"/>
-              </w:rPr>
-            </w:pPr>
-          </w:p>
-        </w:tc>
-        <w:tc>
-          <w:tcPr>
-            <w:tcW w:w="1480" w:type="dxa"/>
-          </w:tcPr>
-          <w:p>
-            <w:pPr>
-              <w:pStyle w:val="TableParagraph"/>
-              <w:rPr>
-                <w:rFonts w:ascii="Times New Roman"/>
-                <w:sz w:val="28"/>
-              </w:rPr>
-            </w:pPr>
-          </w:p>
-        </w:tc>
-        <w:tc>
-          <w:tcPr>
-            <w:tcW w:w="1960" w:type="dxa"/>
-          </w:tcPr>
-          <w:p>
-            <w:pPr>
-              <w:pStyle w:val="TableParagraph"/>
-              <w:rPr>
-                <w:rFonts w:ascii="Times New Roman"/>
-                <w:sz w:val="28"/>
-              </w:rPr>
-            </w:pPr>
-          </w:p>
-        </w:tc>
-        <w:tc>
-          <w:tcPr>
-            <w:tcW w:w="1760" w:type="dxa"/>
-          </w:tcPr>
-          <w:p>
-            <w:pPr>
-              <w:pStyle w:val="TableParagraph"/>
-              <w:rPr>
-                <w:rFonts w:ascii="Times New Roman"/>
-                <w:sz w:val="28"/>
-              </w:rPr>
-            </w:pPr>
-          </w:p>
-        </w:tc>
-      </w:tr>
-      <w:tr>
-        <w:trPr>
-          <w:trHeight w:val="400"/>
-        </w:trPr>
-        <w:tc>
-          <w:tcPr>
-            <w:tcW w:w="880" w:type="dxa"/>
-          </w:tcPr>
-          <w:p>
-            <w:pPr>
-              <w:pStyle w:val="TableParagraph"/>
-              <w:rPr>
-                <w:rFonts w:ascii="Times New Roman"/>
-                <w:sz w:val="28"/>
-              </w:rPr>
-            </w:pPr>
-          </w:p>
-        </w:tc>
-        <w:tc>
-          <w:tcPr>
-            <w:tcW w:w="2120" w:type="dxa"/>
-          </w:tcPr>
-          <w:p>
-            <w:pPr>
-              <w:pStyle w:val="TableParagraph"/>
-              <w:rPr>
-                <w:rFonts w:ascii="Times New Roman"/>
-                <w:sz w:val="28"/>
-              </w:rPr>
-            </w:pPr>
-          </w:p>
-        </w:tc>
-        <w:tc>
-          <w:tcPr>
-            <w:tcW w:w="1120" w:type="dxa"/>
-          </w:tcPr>
-          <w:p>
-            <w:pPr>
-              <w:pStyle w:val="TableParagraph"/>
-              <w:rPr>
-                <w:rFonts w:ascii="Times New Roman"/>
-                <w:sz w:val="28"/>
-              </w:rPr>
-            </w:pPr>
-          </w:p>
-        </w:tc>
-        <w:tc>
-          <w:tcPr>
-            <w:tcW w:w="1480" w:type="dxa"/>
-          </w:tcPr>
-          <w:p>
-            <w:pPr>
-              <w:pStyle w:val="TableParagraph"/>
-              <w:rPr>
-                <w:rFonts w:ascii="Times New Roman"/>
-                <w:sz w:val="28"/>
-              </w:rPr>
-            </w:pPr>
-          </w:p>
-        </w:tc>
-        <w:tc>
-          <w:tcPr>
-            <w:tcW w:w="1960" w:type="dxa"/>
-          </w:tcPr>
-          <w:p>
-            <w:pPr>
-              <w:pStyle w:val="TableParagraph"/>
-              <w:rPr>
-                <w:rFonts w:ascii="Times New Roman"/>
-                <w:sz w:val="28"/>
-              </w:rPr>
-            </w:pPr>
-          </w:p>
-        </w:tc>
-        <w:tc>
-          <w:tcPr>
-            <w:tcW w:w="1760" w:type="dxa"/>
-          </w:tcPr>
-          <w:p>
-            <w:pPr>
-              <w:pStyle w:val="TableParagraph"/>
-              <w:rPr>
-                <w:rFonts w:ascii="Times New Roman"/>
-                <w:sz w:val="28"/>
-              </w:rPr>
-            </w:pPr>
-          </w:p>
-        </w:tc>
-      </w:tr>
-      <w:tr>
-        <w:trPr>
-          <w:trHeight w:val="400"/>
-        </w:trPr>
-        <w:tc>
-          <w:tcPr>
-            <w:tcW w:w="880" w:type="dxa"/>
-          </w:tcPr>
-          <w:p>
-            <w:pPr>
-              <w:pStyle w:val="TableParagraph"/>
-              <w:rPr>
-                <w:rFonts w:ascii="Times New Roman"/>
-                <w:sz w:val="28"/>
-              </w:rPr>
-            </w:pPr>
-          </w:p>
-        </w:tc>
-        <w:tc>
-          <w:tcPr>
-            <w:tcW w:w="2120" w:type="dxa"/>
-          </w:tcPr>
-          <w:p>
-            <w:pPr>
-              <w:pStyle w:val="TableParagraph"/>
-              <w:rPr>
-                <w:rFonts w:ascii="Times New Roman"/>
-                <w:sz w:val="28"/>
-              </w:rPr>
-            </w:pPr>
-          </w:p>
-        </w:tc>
-        <w:tc>
-          <w:tcPr>
-            <w:tcW w:w="1120" w:type="dxa"/>
-          </w:tcPr>
-          <w:p>
-            <w:pPr>
-              <w:pStyle w:val="TableParagraph"/>
-              <w:rPr>
-                <w:rFonts w:ascii="Times New Roman"/>
-                <w:sz w:val="28"/>
-              </w:rPr>
-            </w:pPr>
-          </w:p>
-        </w:tc>
-        <w:tc>
-          <w:tcPr>
-            <w:tcW w:w="1480" w:type="dxa"/>
-          </w:tcPr>
-          <w:p>
-            <w:pPr>
-              <w:pStyle w:val="TableParagraph"/>
-              <w:rPr>
-                <w:rFonts w:ascii="Times New Roman"/>
-                <w:sz w:val="28"/>
-              </w:rPr>
-            </w:pPr>
-          </w:p>
-        </w:tc>
-        <w:tc>
-          <w:tcPr>
-            <w:tcW w:w="1960" w:type="dxa"/>
-          </w:tcPr>
-          <w:p>
-            <w:pPr>
-              <w:pStyle w:val="TableParagraph"/>
-              <w:rPr>
-                <w:rFonts w:ascii="Times New Roman"/>
-                <w:sz w:val="28"/>
-              </w:rPr>
-            </w:pPr>
-          </w:p>
-        </w:tc>
-        <w:tc>
-          <w:tcPr>
-            <w:tcW w:w="1760" w:type="dxa"/>
-          </w:tcPr>
-          <w:p>
-            <w:pPr>
-              <w:pStyle w:val="TableParagraph"/>
-              <w:rPr>
-                <w:rFonts w:ascii="Times New Roman"/>
-                <w:sz w:val="28"/>
-              </w:rPr>
-            </w:pPr>
-          </w:p>
-        </w:tc>
-      </w:tr>
-      <w:tr>
-        <w:trPr>
-          <w:trHeight w:val="400"/>
-        </w:trPr>
-        <w:tc>
-          <w:tcPr>
-            <w:tcW w:w="880" w:type="dxa"/>
-          </w:tcPr>
-          <w:p>
-            <w:pPr>
-              <w:pStyle w:val="TableParagraph"/>
-              <w:rPr>
-                <w:rFonts w:ascii="Times New Roman"/>
-                <w:sz w:val="28"/>
-              </w:rPr>
-            </w:pPr>
-          </w:p>
-        </w:tc>
-        <w:tc>
-          <w:tcPr>
-            <w:tcW w:w="2120" w:type="dxa"/>
-          </w:tcPr>
-          <w:p>
-            <w:pPr>
-              <w:pStyle w:val="TableParagraph"/>
-              <w:rPr>
-                <w:rFonts w:ascii="Times New Roman"/>
-                <w:sz w:val="28"/>
-              </w:rPr>
-            </w:pPr>
-          </w:p>
-        </w:tc>
-        <w:tc>
-          <w:tcPr>
-            <w:tcW w:w="1120" w:type="dxa"/>
-          </w:tcPr>
-          <w:p>
-            <w:pPr>
-              <w:pStyle w:val="TableParagraph"/>
-              <w:rPr>
-                <w:rFonts w:ascii="Times New Roman"/>
-                <w:sz w:val="28"/>
-              </w:rPr>
-            </w:pPr>
-          </w:p>
-        </w:tc>
-        <w:tc>
-          <w:tcPr>
-            <w:tcW w:w="1480" w:type="dxa"/>
-          </w:tcPr>
-          <w:p>
-            <w:pPr>
-              <w:pStyle w:val="TableParagraph"/>
-              <w:rPr>
-                <w:rFonts w:ascii="Times New Roman"/>
-                <w:sz w:val="28"/>
-              </w:rPr>
-            </w:pPr>
-          </w:p>
-        </w:tc>
-        <w:tc>
-          <w:tcPr>
-            <w:tcW w:w="1960" w:type="dxa"/>
-          </w:tcPr>
-          <w:p>
-            <w:pPr>
-              <w:pStyle w:val="TableParagraph"/>
-              <w:rPr>
-                <w:rFonts w:ascii="Times New Roman"/>
-                <w:sz w:val="28"/>
-              </w:rPr>
-            </w:pPr>
-          </w:p>
-        </w:tc>
-        <w:tc>
-          <w:tcPr>
-            <w:tcW w:w="1760" w:type="dxa"/>
-          </w:tcPr>
-          <w:p>
-            <w:pPr>
-              <w:pStyle w:val="TableParagraph"/>
-              <w:rPr>
-                <w:rFonts w:ascii="Times New Roman"/>
-                <w:sz w:val="28"/>
-              </w:rPr>
-            </w:pPr>
-          </w:p>
-        </w:tc>
-      </w:tr>
-      <w:tr>
-        <w:trPr>
-          <w:trHeight w:val="400"/>
-        </w:trPr>
-        <w:tc>
-          <w:tcPr>
-            <w:tcW w:w="880" w:type="dxa"/>
-          </w:tcPr>
-          <w:p>
-            <w:pPr>
-              <w:pStyle w:val="TableParagraph"/>
-              <w:rPr>
-                <w:rFonts w:ascii="Times New Roman"/>
-                <w:sz w:val="28"/>
-              </w:rPr>
-            </w:pPr>
-          </w:p>
-        </w:tc>
-        <w:tc>
-          <w:tcPr>
-            <w:tcW w:w="2120" w:type="dxa"/>
-          </w:tcPr>
-          <w:p>
-            <w:pPr>
-              <w:pStyle w:val="TableParagraph"/>
-              <w:rPr>
-                <w:rFonts w:ascii="Times New Roman"/>
-                <w:sz w:val="28"/>
-              </w:rPr>
-            </w:pPr>
-          </w:p>
-        </w:tc>
-        <w:tc>
-          <w:tcPr>
-            <w:tcW w:w="1120" w:type="dxa"/>
-          </w:tcPr>
-          <w:p>
-            <w:pPr>
-              <w:pStyle w:val="TableParagraph"/>
-              <w:rPr>
-                <w:rFonts w:ascii="Times New Roman"/>
-                <w:sz w:val="28"/>
-              </w:rPr>
-            </w:pPr>
-          </w:p>
-        </w:tc>
-        <w:tc>
-          <w:tcPr>
-            <w:tcW w:w="1480" w:type="dxa"/>
-          </w:tcPr>
-          <w:p>
-            <w:pPr>
-              <w:pStyle w:val="TableParagraph"/>
-              <w:rPr>
-                <w:rFonts w:ascii="Times New Roman"/>
-                <w:sz w:val="28"/>
-              </w:rPr>
-            </w:pPr>
-          </w:p>
-        </w:tc>
-        <w:tc>
-          <w:tcPr>
-            <w:tcW w:w="1960" w:type="dxa"/>
-          </w:tcPr>
-          <w:p>
-            <w:pPr>
-              <w:pStyle w:val="TableParagraph"/>
-              <w:rPr>
-                <w:rFonts w:ascii="Times New Roman"/>
-                <w:sz w:val="28"/>
-              </w:rPr>
-            </w:pPr>
-          </w:p>
-        </w:tc>
-        <w:tc>
-          <w:tcPr>
-            <w:tcW w:w="1760" w:type="dxa"/>
-          </w:tcPr>
-          <w:p>
-            <w:pPr>
-              <w:pStyle w:val="TableParagraph"/>
-              <w:rPr>
-                <w:rFonts w:ascii="Times New Roman"/>
-                <w:sz w:val="28"/>
-              </w:rPr>
-            </w:pPr>
-          </w:p>
-        </w:tc>
-      </w:tr>
-      <w:tr>
-        <w:trPr>
-          <w:trHeight w:val="400"/>
-        </w:trPr>
-        <w:tc>
-          <w:tcPr>
-            <w:tcW w:w="880" w:type="dxa"/>
-          </w:tcPr>
-          <w:p>
-            <w:pPr>
-              <w:pStyle w:val="TableParagraph"/>
-              <w:rPr>
-                <w:rFonts w:ascii="Times New Roman"/>
-                <w:sz w:val="28"/>
-              </w:rPr>
-            </w:pPr>
-          </w:p>
-        </w:tc>
-        <w:tc>
-          <w:tcPr>
-            <w:tcW w:w="2120" w:type="dxa"/>
-          </w:tcPr>
-          <w:p>
-            <w:pPr>
-              <w:pStyle w:val="TableParagraph"/>
-              <w:rPr>
-                <w:rFonts w:ascii="Times New Roman"/>
-                <w:sz w:val="28"/>
-              </w:rPr>
-            </w:pPr>
-          </w:p>
-        </w:tc>
-        <w:tc>
-          <w:tcPr>
-            <w:tcW w:w="1120" w:type="dxa"/>
-          </w:tcPr>
-          <w:p>
-            <w:pPr>
-              <w:pStyle w:val="TableParagraph"/>
-              <w:rPr>
-                <w:rFonts w:ascii="Times New Roman"/>
-                <w:sz w:val="28"/>
-              </w:rPr>
-            </w:pPr>
-          </w:p>
-        </w:tc>
-        <w:tc>
-          <w:tcPr>
-            <w:tcW w:w="1480" w:type="dxa"/>
-          </w:tcPr>
-          <w:p>
-            <w:pPr>
-              <w:pStyle w:val="TableParagraph"/>
-              <w:rPr>
-                <w:rFonts w:ascii="Times New Roman"/>
-                <w:sz w:val="28"/>
-              </w:rPr>
-            </w:pPr>
-          </w:p>
-        </w:tc>
-        <w:tc>
-          <w:tcPr>
-            <w:tcW w:w="1960" w:type="dxa"/>
-          </w:tcPr>
-          <w:p>
-            <w:pPr>
-              <w:pStyle w:val="TableParagraph"/>
-              <w:rPr>
-                <w:rFonts w:ascii="Times New Roman"/>
-                <w:sz w:val="28"/>
-              </w:rPr>
-            </w:pPr>
-          </w:p>
-        </w:tc>
-        <w:tc>
-          <w:tcPr>
-            <w:tcW w:w="1760" w:type="dxa"/>
-          </w:tcPr>
-          <w:p>
-            <w:pPr>
-              <w:pStyle w:val="TableParagraph"/>
-              <w:rPr>
-                <w:rFonts w:ascii="Times New Roman"/>
-                <w:sz w:val="28"/>
-              </w:rPr>
-            </w:pPr>
-          </w:p>
-        </w:tc>
-      </w:tr>
-      <w:tr>
-        <w:trPr>
-          <w:trHeight w:val="400"/>
-        </w:trPr>
-        <w:tc>
-          <w:tcPr>
-            <w:tcW w:w="880" w:type="dxa"/>
-          </w:tcPr>
-          <w:p>
-            <w:pPr>
-              <w:pStyle w:val="TableParagraph"/>
-              <w:rPr>
-                <w:rFonts w:ascii="Times New Roman"/>
-                <w:sz w:val="28"/>
-              </w:rPr>
-            </w:pPr>
-          </w:p>
-        </w:tc>
-        <w:tc>
-          <w:tcPr>
-            <w:tcW w:w="2120" w:type="dxa"/>
-          </w:tcPr>
-          <w:p>
-            <w:pPr>
-              <w:pStyle w:val="TableParagraph"/>
-              <w:rPr>
-                <w:rFonts w:ascii="Times New Roman"/>
-                <w:sz w:val="28"/>
-              </w:rPr>
-            </w:pPr>
-          </w:p>
-        </w:tc>
-        <w:tc>
-          <w:tcPr>
-            <w:tcW w:w="1120" w:type="dxa"/>
-          </w:tcPr>
-          <w:p>
-            <w:pPr>
-              <w:pStyle w:val="TableParagraph"/>
-              <w:rPr>
-                <w:rFonts w:ascii="Times New Roman"/>
-                <w:sz w:val="28"/>
-              </w:rPr>
-            </w:pPr>
-          </w:p>
-        </w:tc>
-        <w:tc>
-          <w:tcPr>
-            <w:tcW w:w="1480" w:type="dxa"/>
-          </w:tcPr>
-          <w:p>
-            <w:pPr>
-              <w:pStyle w:val="TableParagraph"/>
-              <w:rPr>
-                <w:rFonts w:ascii="Times New Roman"/>
-                <w:sz w:val="28"/>
-              </w:rPr>
-            </w:pPr>
-          </w:p>
-        </w:tc>
-        <w:tc>
-          <w:tcPr>
-            <w:tcW w:w="1960" w:type="dxa"/>
-          </w:tcPr>
-          <w:p>
-            <w:pPr>
-              <w:pStyle w:val="TableParagraph"/>
-              <w:rPr>
-                <w:rFonts w:ascii="Times New Roman"/>
-                <w:sz w:val="28"/>
-              </w:rPr>
-            </w:pPr>
-          </w:p>
-        </w:tc>
-        <w:tc>
-          <w:tcPr>
-            <w:tcW w:w="1760" w:type="dxa"/>
-          </w:tcPr>
-          <w:p>
-            <w:pPr>
-              <w:pStyle w:val="TableParagraph"/>
-              <w:rPr>
-                <w:rFonts w:ascii="Times New Roman"/>
-                <w:sz w:val="28"/>
-              </w:rPr>
-            </w:pPr>
-          </w:p>
-        </w:tc>
-      </w:tr>
-      <w:tr>
-        <w:trPr>
-          <w:trHeight w:val="419"/>
-        </w:trPr>
-        <w:tc>
-          <w:tcPr>
-            <w:tcW w:w="880" w:type="dxa"/>
-          </w:tcPr>
-          <w:p>
-            <w:pPr>
-              <w:pStyle w:val="TableParagraph"/>
-              <w:rPr>
-                <w:rFonts w:ascii="Times New Roman"/>
-                <w:sz w:val="28"/>
-              </w:rPr>
-            </w:pPr>
-          </w:p>
-        </w:tc>
-        <w:tc>
-          <w:tcPr>
-            <w:tcW w:w="2120" w:type="dxa"/>
-          </w:tcPr>
-          <w:p>
-            <w:pPr>
-              <w:pStyle w:val="TableParagraph"/>
-              <w:rPr>
-                <w:rFonts w:ascii="Times New Roman"/>
-                <w:sz w:val="28"/>
-              </w:rPr>
-            </w:pPr>
-          </w:p>
-        </w:tc>
-        <w:tc>
-          <w:tcPr>
-            <w:tcW w:w="1120" w:type="dxa"/>
-          </w:tcPr>
-          <w:p>
-            <w:pPr>
-              <w:pStyle w:val="TableParagraph"/>
-              <w:rPr>
-                <w:rFonts w:ascii="Times New Roman"/>
-                <w:sz w:val="28"/>
-              </w:rPr>
-            </w:pPr>
-          </w:p>
-        </w:tc>
-        <w:tc>
-          <w:tcPr>
-            <w:tcW w:w="1480" w:type="dxa"/>
-          </w:tcPr>
-          <w:p>
-            <w:pPr>
-              <w:pStyle w:val="TableParagraph"/>
-              <w:rPr>
-                <w:rFonts w:ascii="Times New Roman"/>
-                <w:sz w:val="28"/>
-              </w:rPr>
-            </w:pPr>
-          </w:p>
-        </w:tc>
-        <w:tc>
-          <w:tcPr>
-            <w:tcW w:w="1960" w:type="dxa"/>
-          </w:tcPr>
-          <w:p>
-            <w:pPr>
-              <w:pStyle w:val="TableParagraph"/>
-              <w:rPr>
-                <w:rFonts w:ascii="Times New Roman"/>
-                <w:sz w:val="28"/>
-              </w:rPr>
-            </w:pPr>
-          </w:p>
-        </w:tc>
-        <w:tc>
-          <w:tcPr>
-            <w:tcW w:w="1760" w:type="dxa"/>
-          </w:tcPr>
-          <w:p>
-            <w:pPr>
-              <w:pStyle w:val="TableParagraph"/>
-              <w:rPr>
-                <w:rFonts w:ascii="Times New Roman"/>
-                <w:sz w:val="28"/>
-              </w:rPr>
-            </w:pPr>
-          </w:p>
-        </w:tc>
-      </w:tr>
-    </w:tbl>
-    <w:p>
-      <w:pPr>
-        <w:pStyle w:val="TableParagraph"/>
-        <w:rPr>
-          <w:rFonts w:ascii="Times New Roman"/>
-          <w:sz w:val="28"/>
-        </w:rPr>
-        <w:sectPr>
-          <w:pgSz w:w="11920" w:h="16840"/>
-          <w:pgMar w:top="3900" w:right="992" w:bottom="280" w:left="1275" w:header="1470" w:footer="0" w:gutter="0"/>
-          <w:cols w:space="720"/>
-        </w:sectPr>
-      </w:pPr>
-    </w:p>
     <w:p>
       <w:pPr>
         <w:jc w:val="center"/>
@@ -3258,7 +23,6 @@
           <w:szCs w:val="28"/>
           <w:u w:val="single"/>
         </w:rPr>
-        <w:lastRenderedPageBreak/>
         <w:t>Lab Sheet–01</w:t>
       </w:r>
     </w:p>
@@ -3852,6 +616,7 @@
       <w:r>
         <w:rPr>
           <w:rFonts w:ascii="Times New Roman" w:hAnsi="Times New Roman" w:cs="Times New Roman"/>
+          <w:noProof/>
           <w:sz w:val="28"/>
           <w:szCs w:val="28"/>
         </w:rPr>
@@ -3871,7 +636,7 @@
                     <pic:cNvPicPr/>
                   </pic:nvPicPr>
                   <pic:blipFill>
-                    <a:blip r:embed="rId11"/>
+                    <a:blip r:embed="rId7"/>
                     <a:stretch>
                       <a:fillRect/>
                     </a:stretch>
@@ -4055,6 +820,7 @@
       <w:r>
         <w:rPr>
           <w:rFonts w:ascii="Times New Roman" w:hAnsi="Times New Roman" w:cs="Times New Roman"/>
+          <w:noProof/>
           <w:sz w:val="28"/>
           <w:szCs w:val="28"/>
         </w:rPr>
@@ -4074,7 +840,7 @@
                     <pic:cNvPicPr/>
                   </pic:nvPicPr>
                   <pic:blipFill>
-                    <a:blip r:embed="rId12"/>
+                    <a:blip r:embed="rId8"/>
                     <a:stretch>
                       <a:fillRect/>
                     </a:stretch>
@@ -4349,6 +1115,7 @@
       <w:r>
         <w:rPr>
           <w:rFonts w:ascii="Times New Roman" w:hAnsi="Times New Roman" w:cs="Times New Roman"/>
+          <w:noProof/>
           <w:sz w:val="28"/>
           <w:szCs w:val="28"/>
         </w:rPr>
@@ -4368,7 +1135,7 @@
                     <pic:cNvPicPr/>
                   </pic:nvPicPr>
                   <pic:blipFill>
-                    <a:blip r:embed="rId13"/>
+                    <a:blip r:embed="rId9"/>
                     <a:stretch>
                       <a:fillRect/>
                     </a:stretch>
@@ -4606,6 +1373,7 @@
       <w:r>
         <w:rPr>
           <w:rFonts w:ascii="Times New Roman" w:hAnsi="Times New Roman" w:cs="Times New Roman"/>
+          <w:noProof/>
           <w:sz w:val="28"/>
           <w:szCs w:val="28"/>
         </w:rPr>
@@ -4625,7 +1393,7 @@
                     <pic:cNvPicPr/>
                   </pic:nvPicPr>
                   <pic:blipFill>
-                    <a:blip r:embed="rId14"/>
+                    <a:blip r:embed="rId10"/>
                     <a:stretch>
                       <a:fillRect/>
                     </a:stretch>
@@ -4945,6 +1713,7 @@
       <w:r>
         <w:rPr>
           <w:rFonts w:ascii="Times New Roman" w:hAnsi="Times New Roman" w:cs="Times New Roman"/>
+          <w:noProof/>
           <w:sz w:val="28"/>
           <w:szCs w:val="28"/>
         </w:rPr>
@@ -4965,7 +1734,7 @@
                     <pic:cNvPicPr/>
                   </pic:nvPicPr>
                   <pic:blipFill>
-                    <a:blip r:embed="rId15"/>
+                    <a:blip r:embed="rId11"/>
                     <a:stretch>
                       <a:fillRect/>
                     </a:stretch>
@@ -5206,6 +1975,7 @@
       <w:r>
         <w:rPr>
           <w:rFonts w:ascii="Times New Roman" w:hAnsi="Times New Roman" w:cs="Times New Roman"/>
+          <w:noProof/>
           <w:sz w:val="28"/>
           <w:szCs w:val="28"/>
         </w:rPr>
@@ -5225,7 +1995,7 @@
                     <pic:cNvPicPr/>
                   </pic:nvPicPr>
                   <pic:blipFill>
-                    <a:blip r:embed="rId16"/>
+                    <a:blip r:embed="rId12"/>
                     <a:stretch>
                       <a:fillRect/>
                     </a:stretch>
@@ -5482,6 +2252,7 @@
       <w:r>
         <w:rPr>
           <w:rFonts w:ascii="Times New Roman" w:hAnsi="Times New Roman" w:cs="Times New Roman"/>
+          <w:noProof/>
           <w:sz w:val="28"/>
           <w:szCs w:val="28"/>
         </w:rPr>
@@ -5501,7 +2272,7 @@
                     <pic:cNvPicPr/>
                   </pic:nvPicPr>
                   <pic:blipFill>
-                    <a:blip r:embed="rId17"/>
+                    <a:blip r:embed="rId13"/>
                     <a:stretch>
                       <a:fillRect/>
                     </a:stretch>
@@ -5712,6 +2483,7 @@
       <w:r>
         <w:rPr>
           <w:rFonts w:ascii="Times New Roman" w:hAnsi="Times New Roman" w:cs="Times New Roman"/>
+          <w:noProof/>
           <w:sz w:val="28"/>
           <w:szCs w:val="28"/>
         </w:rPr>
@@ -5731,7 +2503,7 @@
                     <pic:cNvPicPr/>
                   </pic:nvPicPr>
                   <pic:blipFill>
-                    <a:blip r:embed="rId18"/>
+                    <a:blip r:embed="rId14"/>
                     <a:stretch>
                       <a:fillRect/>
                     </a:stretch>
@@ -5922,6 +2694,7 @@
       <w:r>
         <w:rPr>
           <w:rFonts w:ascii="Times New Roman" w:hAnsi="Times New Roman" w:cs="Times New Roman"/>
+          <w:noProof/>
           <w:sz w:val="28"/>
           <w:szCs w:val="28"/>
         </w:rPr>
@@ -5941,7 +2714,7 @@
                     <pic:cNvPicPr/>
                   </pic:nvPicPr>
                   <pic:blipFill>
-                    <a:blip r:embed="rId19"/>
+                    <a:blip r:embed="rId15"/>
                     <a:stretch>
                       <a:fillRect/>
                     </a:stretch>
@@ -6152,6 +2925,7 @@
       <w:r>
         <w:rPr>
           <w:rFonts w:ascii="Times New Roman" w:hAnsi="Times New Roman" w:cs="Times New Roman"/>
+          <w:noProof/>
           <w:sz w:val="28"/>
           <w:szCs w:val="28"/>
         </w:rPr>
@@ -6171,7 +2945,7 @@
                     <pic:cNvPicPr/>
                   </pic:nvPicPr>
                   <pic:blipFill>
-                    <a:blip r:embed="rId20"/>
+                    <a:blip r:embed="rId16"/>
                     <a:stretch>
                       <a:fillRect/>
                     </a:stretch>
@@ -6446,6 +3220,7 @@
       <w:r>
         <w:rPr>
           <w:rFonts w:ascii="Times New Roman" w:hAnsi="Times New Roman" w:cs="Times New Roman"/>
+          <w:noProof/>
           <w:sz w:val="28"/>
           <w:szCs w:val="28"/>
         </w:rPr>
@@ -6466,7 +3241,7 @@
                     <pic:cNvPicPr/>
                   </pic:nvPicPr>
                   <pic:blipFill>
-                    <a:blip r:embed="rId21"/>
+                    <a:blip r:embed="rId17"/>
                     <a:stretch>
                       <a:fillRect/>
                     </a:stretch>
@@ -6677,6 +3452,7 @@
       <w:r>
         <w:rPr>
           <w:rFonts w:ascii="Times New Roman" w:hAnsi="Times New Roman" w:cs="Times New Roman"/>
+          <w:noProof/>
           <w:sz w:val="28"/>
           <w:szCs w:val="28"/>
         </w:rPr>
@@ -6696,7 +3472,7 @@
                     <pic:cNvPicPr/>
                   </pic:nvPicPr>
                   <pic:blipFill>
-                    <a:blip r:embed="rId22"/>
+                    <a:blip r:embed="rId18"/>
                     <a:stretch>
                       <a:fillRect/>
                     </a:stretch>
@@ -6907,6 +3683,7 @@
       <w:r>
         <w:rPr>
           <w:rFonts w:ascii="Times New Roman" w:hAnsi="Times New Roman" w:cs="Times New Roman"/>
+          <w:noProof/>
           <w:sz w:val="28"/>
           <w:szCs w:val="28"/>
         </w:rPr>
@@ -6927,7 +3704,7 @@
                     <pic:cNvPicPr/>
                   </pic:nvPicPr>
                   <pic:blipFill>
-                    <a:blip r:embed="rId23"/>
+                    <a:blip r:embed="rId19"/>
                     <a:stretch>
                       <a:fillRect/>
                     </a:stretch>
@@ -7120,6 +3897,7 @@
       <w:r>
         <w:rPr>
           <w:rFonts w:ascii="Times New Roman" w:hAnsi="Times New Roman" w:cs="Times New Roman"/>
+          <w:noProof/>
           <w:sz w:val="28"/>
           <w:szCs w:val="28"/>
         </w:rPr>
@@ -7139,7 +3917,7 @@
                     <pic:cNvPicPr/>
                   </pic:nvPicPr>
                   <pic:blipFill>
-                    <a:blip r:embed="rId24"/>
+                    <a:blip r:embed="rId20"/>
                     <a:stretch>
                       <a:fillRect/>
                     </a:stretch>
@@ -7332,6 +4110,7 @@
       <w:r>
         <w:rPr>
           <w:rFonts w:ascii="Times New Roman" w:hAnsi="Times New Roman" w:cs="Times New Roman"/>
+          <w:noProof/>
           <w:sz w:val="28"/>
           <w:szCs w:val="28"/>
         </w:rPr>
@@ -7351,7 +4130,7 @@
                     <pic:cNvPicPr/>
                   </pic:nvPicPr>
                   <pic:blipFill>
-                    <a:blip r:embed="rId25"/>
+                    <a:blip r:embed="rId21"/>
                     <a:stretch>
                       <a:fillRect/>
                     </a:stretch>
@@ -7554,6 +4333,7 @@
       <w:r>
         <w:rPr>
           <w:rFonts w:ascii="Times New Roman" w:hAnsi="Times New Roman" w:cs="Times New Roman"/>
+          <w:noProof/>
           <w:sz w:val="28"/>
           <w:szCs w:val="28"/>
         </w:rPr>
@@ -7574,7 +4354,7 @@
                     <pic:cNvPicPr/>
                   </pic:nvPicPr>
                   <pic:blipFill>
-                    <a:blip r:embed="rId26"/>
+                    <a:blip r:embed="rId22"/>
                     <a:stretch>
                       <a:fillRect/>
                     </a:stretch>
@@ -7767,6 +4547,7 @@
       <w:r>
         <w:rPr>
           <w:rFonts w:ascii="Times New Roman" w:hAnsi="Times New Roman" w:cs="Times New Roman"/>
+          <w:noProof/>
           <w:sz w:val="28"/>
           <w:szCs w:val="28"/>
         </w:rPr>
@@ -7786,7 +4567,7 @@
                     <pic:cNvPicPr/>
                   </pic:nvPicPr>
                   <pic:blipFill>
-                    <a:blip r:embed="rId27"/>
+                    <a:blip r:embed="rId23"/>
                     <a:stretch>
                       <a:fillRect/>
                     </a:stretch>
@@ -7969,6 +4750,7 @@
       <w:r>
         <w:rPr>
           <w:rFonts w:ascii="Times New Roman" w:hAnsi="Times New Roman" w:cs="Times New Roman"/>
+          <w:noProof/>
           <w:sz w:val="28"/>
           <w:szCs w:val="28"/>
         </w:rPr>
@@ -7988,7 +4770,7 @@
                     <pic:cNvPicPr/>
                   </pic:nvPicPr>
                   <pic:blipFill>
-                    <a:blip r:embed="rId28"/>
+                    <a:blip r:embed="rId24"/>
                     <a:stretch>
                       <a:fillRect/>
                     </a:stretch>
@@ -8182,6 +4964,7 @@
       <w:r>
         <w:rPr>
           <w:rFonts w:ascii="Times New Roman" w:hAnsi="Times New Roman" w:cs="Times New Roman"/>
+          <w:noProof/>
           <w:sz w:val="28"/>
           <w:szCs w:val="28"/>
         </w:rPr>
@@ -8201,7 +4984,7 @@
                     <pic:cNvPicPr/>
                   </pic:nvPicPr>
                   <pic:blipFill>
-                    <a:blip r:embed="rId29"/>
+                    <a:blip r:embed="rId25"/>
                     <a:stretch>
                       <a:fillRect/>
                     </a:stretch>
@@ -8412,6 +5195,7 @@
       <w:r>
         <w:rPr>
           <w:rFonts w:ascii="Times New Roman" w:hAnsi="Times New Roman" w:cs="Times New Roman"/>
+          <w:noProof/>
           <w:sz w:val="28"/>
           <w:szCs w:val="28"/>
         </w:rPr>
@@ -8431,7 +5215,7 @@
                     <pic:cNvPicPr/>
                   </pic:nvPicPr>
                   <pic:blipFill>
-                    <a:blip r:embed="rId30"/>
+                    <a:blip r:embed="rId26"/>
                     <a:stretch>
                       <a:fillRect/>
                     </a:stretch>
@@ -8640,6 +5424,7 @@
       <w:r>
         <w:rPr>
           <w:rFonts w:ascii="Times New Roman" w:hAnsi="Times New Roman" w:cs="Times New Roman"/>
+          <w:noProof/>
           <w:sz w:val="28"/>
           <w:szCs w:val="28"/>
         </w:rPr>
@@ -8660,7 +5445,7 @@
                     <pic:cNvPicPr/>
                   </pic:nvPicPr>
                   <pic:blipFill>
-                    <a:blip r:embed="rId31"/>
+                    <a:blip r:embed="rId27"/>
                     <a:stretch>
                       <a:fillRect/>
                     </a:stretch>
@@ -8887,6 +5672,7 @@
       <w:r>
         <w:rPr>
           <w:rFonts w:ascii="Times New Roman" w:hAnsi="Times New Roman" w:cs="Times New Roman"/>
+          <w:noProof/>
           <w:sz w:val="28"/>
           <w:szCs w:val="28"/>
         </w:rPr>
@@ -8906,7 +5692,7 @@
                     <pic:cNvPicPr/>
                   </pic:nvPicPr>
                   <pic:blipFill>
-                    <a:blip r:embed="rId32"/>
+                    <a:blip r:embed="rId28"/>
                     <a:stretch>
                       <a:fillRect/>
                     </a:stretch>
@@ -9111,7 +5897,16 @@
           <w:sz w:val="28"/>
           <w:szCs w:val="28"/>
         </w:rPr>
-        <w:t>Student_Name</w:t>
+        <w:t>Student_</w:t>
+      </w:r>
+      <w:proofErr w:type="gramStart"/>
+      <w:r>
+        <w:rPr>
+          <w:rFonts w:ascii="Times New Roman" w:hAnsi="Times New Roman" w:cs="Times New Roman"/>
+          <w:sz w:val="28"/>
+          <w:szCs w:val="28"/>
+        </w:rPr>
+        <w:t>Name</w:t>
       </w:r>
       <w:proofErr w:type="spellEnd"/>
       <w:r>
@@ -9120,7 +5915,16 @@
           <w:sz w:val="28"/>
           <w:szCs w:val="28"/>
         </w:rPr>
-        <w:t>"})</w:t>
+        <w:t>"}</w:t>
+      </w:r>
+      <w:proofErr w:type="gramEnd"/>
+      <w:r>
+        <w:rPr>
+          <w:rFonts w:ascii="Times New Roman" w:hAnsi="Times New Roman" w:cs="Times New Roman"/>
+          <w:sz w:val="28"/>
+          <w:szCs w:val="28"/>
+        </w:rPr>
+        <w:t>)</w:t>
       </w:r>
     </w:p>
     <w:p>
@@ -9183,6 +5987,7 @@
       <w:r>
         <w:rPr>
           <w:rFonts w:ascii="Times New Roman" w:hAnsi="Times New Roman" w:cs="Times New Roman"/>
+          <w:noProof/>
           <w:sz w:val="28"/>
           <w:szCs w:val="28"/>
         </w:rPr>
@@ -9203,7 +6008,7 @@
                     <pic:cNvPicPr/>
                   </pic:nvPicPr>
                   <pic:blipFill>
-                    <a:blip r:embed="rId33"/>
+                    <a:blip r:embed="rId29"/>
                     <a:stretch>
                       <a:fillRect/>
                     </a:stretch>
@@ -9458,6 +6263,7 @@
       <w:r>
         <w:rPr>
           <w:rFonts w:ascii="Times New Roman" w:hAnsi="Times New Roman" w:cs="Times New Roman"/>
+          <w:noProof/>
           <w:sz w:val="28"/>
           <w:szCs w:val="28"/>
         </w:rPr>
@@ -9477,7 +6283,7 @@
                     <pic:cNvPicPr/>
                   </pic:nvPicPr>
                   <pic:blipFill>
-                    <a:blip r:embed="rId34"/>
+                    <a:blip r:embed="rId30"/>
                     <a:stretch>
                       <a:fillRect/>
                     </a:stretch>
@@ -9726,6 +6532,7 @@
       <w:r>
         <w:rPr>
           <w:rFonts w:ascii="Times New Roman" w:hAnsi="Times New Roman" w:cs="Times New Roman"/>
+          <w:noProof/>
           <w:sz w:val="28"/>
           <w:szCs w:val="28"/>
         </w:rPr>
@@ -9745,7 +6552,7 @@
                     <pic:cNvPicPr/>
                   </pic:nvPicPr>
                   <pic:blipFill>
-                    <a:blip r:embed="rId35"/>
+                    <a:blip r:embed="rId31"/>
                     <a:stretch>
                       <a:fillRect/>
                     </a:stretch>
@@ -9954,6 +6761,7 @@
       <w:r>
         <w:rPr>
           <w:rFonts w:ascii="Times New Roman" w:hAnsi="Times New Roman" w:cs="Times New Roman"/>
+          <w:noProof/>
           <w:sz w:val="28"/>
           <w:szCs w:val="28"/>
         </w:rPr>
@@ -9974,7 +6782,7 @@
                     <pic:cNvPicPr/>
                   </pic:nvPicPr>
                   <pic:blipFill>
-                    <a:blip r:embed="rId36"/>
+                    <a:blip r:embed="rId32"/>
                     <a:stretch>
                       <a:fillRect/>
                     </a:stretch>
@@ -10211,6 +7019,7 @@
       <w:r>
         <w:rPr>
           <w:rFonts w:ascii="Times New Roman" w:hAnsi="Times New Roman" w:cs="Times New Roman"/>
+          <w:noProof/>
           <w:sz w:val="28"/>
           <w:szCs w:val="28"/>
         </w:rPr>
@@ -10230,7 +7039,7 @@
                     <pic:cNvPicPr/>
                   </pic:nvPicPr>
                   <pic:blipFill>
-                    <a:blip r:embed="rId37"/>
+                    <a:blip r:embed="rId33"/>
                     <a:stretch>
                       <a:fillRect/>
                     </a:stretch>
@@ -10451,6 +7260,7 @@
       <w:r>
         <w:rPr>
           <w:rFonts w:ascii="Times New Roman" w:hAnsi="Times New Roman" w:cs="Times New Roman"/>
+          <w:noProof/>
           <w:sz w:val="28"/>
           <w:szCs w:val="28"/>
         </w:rPr>
@@ -10471,7 +7281,7 @@
                     <pic:cNvPicPr/>
                   </pic:nvPicPr>
                   <pic:blipFill>
-                    <a:blip r:embed="rId38"/>
+                    <a:blip r:embed="rId34"/>
                     <a:stretch>
                       <a:fillRect/>
                     </a:stretch>
@@ -10712,6 +7522,7 @@
       <w:r>
         <w:rPr>
           <w:rFonts w:ascii="Times New Roman" w:hAnsi="Times New Roman" w:cs="Times New Roman"/>
+          <w:noProof/>
           <w:sz w:val="28"/>
           <w:szCs w:val="28"/>
         </w:rPr>
@@ -10731,7 +7542,7 @@
                     <pic:cNvPicPr/>
                   </pic:nvPicPr>
                   <pic:blipFill>
-                    <a:blip r:embed="rId39"/>
+                    <a:blip r:embed="rId35"/>
                     <a:stretch>
                       <a:fillRect/>
                     </a:stretch>
@@ -10996,6 +7807,7 @@
       <w:r>
         <w:rPr>
           <w:rFonts w:ascii="Times New Roman" w:hAnsi="Times New Roman" w:cs="Times New Roman"/>
+          <w:noProof/>
           <w:sz w:val="28"/>
           <w:szCs w:val="28"/>
         </w:rPr>
@@ -11016,7 +7828,7 @@
                     <pic:cNvPicPr/>
                   </pic:nvPicPr>
                   <pic:blipFill>
-                    <a:blip r:embed="rId40"/>
+                    <a:blip r:embed="rId36"/>
                     <a:stretch>
                       <a:fillRect/>
                     </a:stretch>
@@ -11245,6 +8057,7 @@
       <w:r>
         <w:rPr>
           <w:rFonts w:ascii="Times New Roman" w:hAnsi="Times New Roman" w:cs="Times New Roman"/>
+          <w:noProof/>
           <w:sz w:val="28"/>
           <w:szCs w:val="28"/>
         </w:rPr>
@@ -11264,7 +8077,7 @@
                     <pic:cNvPicPr/>
                   </pic:nvPicPr>
                   <pic:blipFill>
-                    <a:blip r:embed="rId41"/>
+                    <a:blip r:embed="rId37"/>
                     <a:stretch>
                       <a:fillRect/>
                     </a:stretch>
@@ -11585,6 +8398,7 @@
       <w:r>
         <w:rPr>
           <w:rFonts w:ascii="Times New Roman" w:hAnsi="Times New Roman" w:cs="Times New Roman"/>
+          <w:noProof/>
           <w:sz w:val="28"/>
           <w:szCs w:val="28"/>
         </w:rPr>
@@ -11604,7 +8418,7 @@
                     <pic:cNvPicPr/>
                   </pic:nvPicPr>
                   <pic:blipFill>
-                    <a:blip r:embed="rId42"/>
+                    <a:blip r:embed="rId38"/>
                     <a:stretch>
                       <a:fillRect/>
                     </a:stretch>
@@ -11905,6 +8719,7 @@
       <w:r>
         <w:rPr>
           <w:rFonts w:ascii="Times New Roman" w:hAnsi="Times New Roman" w:cs="Times New Roman"/>
+          <w:noProof/>
           <w:sz w:val="28"/>
           <w:szCs w:val="28"/>
         </w:rPr>
@@ -11924,7 +8739,7 @@
                     <pic:cNvPicPr/>
                   </pic:nvPicPr>
                   <pic:blipFill>
-                    <a:blip r:embed="rId43"/>
+                    <a:blip r:embed="rId39"/>
                     <a:stretch>
                       <a:fillRect/>
                     </a:stretch>
@@ -12255,6 +9070,7 @@
       <w:r>
         <w:rPr>
           <w:rFonts w:ascii="Times New Roman" w:hAnsi="Times New Roman" w:cs="Times New Roman"/>
+          <w:noProof/>
           <w:sz w:val="28"/>
           <w:szCs w:val="28"/>
         </w:rPr>
@@ -12275,7 +9091,7 @@
                     <pic:cNvPicPr/>
                   </pic:nvPicPr>
                   <pic:blipFill>
-                    <a:blip r:embed="rId44"/>
+                    <a:blip r:embed="rId40"/>
                     <a:stretch>
                       <a:fillRect/>
                     </a:stretch>
@@ -12716,6 +9532,7 @@
       <w:r>
         <w:rPr>
           <w:rFonts w:ascii="Times New Roman" w:hAnsi="Times New Roman" w:cs="Times New Roman"/>
+          <w:noProof/>
           <w:sz w:val="28"/>
           <w:szCs w:val="28"/>
         </w:rPr>
@@ -12735,7 +9552,7 @@
                     <pic:cNvPicPr/>
                   </pic:nvPicPr>
                   <pic:blipFill>
-                    <a:blip r:embed="rId45"/>
+                    <a:blip r:embed="rId41"/>
                     <a:stretch>
                       <a:fillRect/>
                     </a:stretch>
@@ -12775,7 +9592,7 @@
           <w:szCs w:val="28"/>
         </w:rPr>
       </w:pPr>
-      <w:hyperlink r:id="rId46" w:history="1">
+      <w:hyperlink r:id="rId42" w:history="1">
         <w:r>
           <w:rPr>
             <w:rStyle w:val="Hyperlink"/>
@@ -12890,7 +9707,7 @@
       </w:r>
     </w:p>
     <w:sectPr>
-      <w:headerReference w:type="default" r:id="rId47"/>
+      <w:headerReference w:type="default" r:id="rId43"/>
       <w:pgSz w:w="11920" w:h="16840"/>
       <w:pgMar w:top="1420" w:right="992" w:bottom="280" w:left="1275" w:header="0" w:footer="0" w:gutter="0"/>
       <w:cols w:space="720"/>
@@ -12900,7 +9717,7 @@
 </file>
 
 <file path=word/endnotes.xml><?xml version="1.0" encoding="utf-8"?>
-<w:endnotes xmlns:wpc="http://schemas.microsoft.com/office/word/2010/wordprocessingCanvas" xmlns:cx="http://schemas.microsoft.com/office/drawing/2014/chartex" xmlns:cx1="http://schemas.microsoft.com/office/drawing/2015/9/8/chartex" xmlns:cx2="http://schemas.microsoft.com/office/drawing/2015/10/21/chartex" xmlns:cx3="http://schemas.microsoft.com/office/drawing/2016/5/9/chartex" xmlns:cx4="http://schemas.microsoft.com/office/drawing/2016/5/10/chartex" xmlns:cx5="http://schemas.microsoft.com/office/drawing/2016/5/11/chartex" xmlns:cx6="http://schemas.microsoft.com/office/drawing/2016/5/12/chartex" xmlns:cx7="http://schemas.microsoft.com/office/drawing/2016/5/13/chartex" xmlns:cx8="http://schemas.microsoft.com/office/drawing/2016/5/14/chartex" xmlns:mc="http://schemas.openxmlformats.org/markup-compatibility/2006" xmlns:aink="http://schemas.microsoft.com/office/drawing/2016/ink" xmlns:am3d="http://schemas.microsoft.com/office/drawing/2017/model3d" xmlns:o="urn:schemas-microsoft-com:office:office" xmlns:oel="http://schemas.microsoft.com/office/2019/extlst" xmlns:r="http://schemas.openxmlformats.org/officeDocument/2006/relationships" xmlns:m="http://schemas.openxmlformats.org/officeDocument/2006/math" xmlns:v="urn:schemas-microsoft-com:vml" xmlns:wp14="http://schemas.microsoft.com/office/word/2010/wordprocessingDrawing" xmlns:wp="http://schemas.openxmlformats.org/drawingml/2006/wordprocessingDrawing" xmlns:w10="urn:schemas-microsoft-com:office:word" xmlns:w="http://schemas.openxmlformats.org/wordprocessingml/2006/main" xmlns:w14="http://schemas.microsoft.com/office/word/2010/wordml" xmlns:w15="http://schemas.microsoft.com/office/word/2012/wordml" xmlns:w16cei="http://schemas.microsoft.com/office/word/2026/wordml/cei" xmlns:w16cex="http://schemas.microsoft.com/office/word/2018/wordml/cex" xmlns:w16cid="http://schemas.microsoft.com/office/word/2016/wordml/cid" xmlns:w16="http://schemas.microsoft.com/office/word/2018/wordml" xmlns:w16du="http://schemas.microsoft.com/office/word/2023/wordml/word16du" xmlns:w16sdtdh="http://schemas.microsoft.com/office/word/2020/wordml/sdtdatahash" xmlns:w16sdtfl="http://schemas.microsoft.com/office/word/2024/wordml/sdtformatlock" xmlns:w16se="http://schemas.microsoft.com/office/word/2015/wordml/symex" xmlns:wpg="http://schemas.microsoft.com/office/word/2010/wordprocessingGroup" xmlns:wpi="http://schemas.microsoft.com/office/word/2010/wordprocessingInk" xmlns:wne="http://schemas.microsoft.com/office/word/2006/wordml" xmlns:wps="http://schemas.microsoft.com/office/word/2010/wordprocessingShape" mc:Ignorable="w14 w15 w16se w16cid w16 w16cex w16sdtdh w16sdtfl w16du wp14">
+<w:endnotes xmlns:wpc="http://schemas.microsoft.com/office/word/2010/wordprocessingCanvas" xmlns:cx="http://schemas.microsoft.com/office/drawing/2014/chartex" xmlns:cx1="http://schemas.microsoft.com/office/drawing/2015/9/8/chartex" xmlns:cx2="http://schemas.microsoft.com/office/drawing/2015/10/21/chartex" xmlns:cx3="http://schemas.microsoft.com/office/drawing/2016/5/9/chartex" xmlns:cx4="http://schemas.microsoft.com/office/drawing/2016/5/10/chartex" xmlns:cx5="http://schemas.microsoft.com/office/drawing/2016/5/11/chartex" xmlns:cx6="http://schemas.microsoft.com/office/drawing/2016/5/12/chartex" xmlns:cx7="http://schemas.microsoft.com/office/drawing/2016/5/13/chartex" xmlns:cx8="http://schemas.microsoft.com/office/drawing/2016/5/14/chartex" xmlns:mc="http://schemas.openxmlformats.org/markup-compatibility/2006" xmlns:aink="http://schemas.microsoft.com/office/drawing/2016/ink" xmlns:am3d="http://schemas.microsoft.com/office/drawing/2017/model3d" xmlns:o="urn:schemas-microsoft-com:office:office" xmlns:oel="http://schemas.microsoft.com/office/2019/extlst" xmlns:r="http://schemas.openxmlformats.org/officeDocument/2006/relationships" xmlns:m="http://schemas.openxmlformats.org/officeDocument/2006/math" xmlns:v="urn:schemas-microsoft-com:vml" xmlns:wp14="http://schemas.microsoft.com/office/word/2010/wordprocessingDrawing" xmlns:wp="http://schemas.openxmlformats.org/drawingml/2006/wordprocessingDrawing" xmlns:w10="urn:schemas-microsoft-com:office:word" xmlns:w="http://schemas.openxmlformats.org/wordprocessingml/2006/main" xmlns:w14="http://schemas.microsoft.com/office/word/2010/wordml" xmlns:w15="http://schemas.microsoft.com/office/word/2012/wordml" xmlns:w16cex="http://schemas.microsoft.com/office/word/2018/wordml/cex" xmlns:w16cid="http://schemas.microsoft.com/office/word/2016/wordml/cid" xmlns:w16="http://schemas.microsoft.com/office/word/2018/wordml" xmlns:w16du="http://schemas.microsoft.com/office/word/2023/wordml/word16du" xmlns:w16sdtdh="http://schemas.microsoft.com/office/word/2020/wordml/sdtdatahash" xmlns:w16sdtfl="http://schemas.microsoft.com/office/word/2024/wordml/sdtformatlock" xmlns:w16se="http://schemas.microsoft.com/office/word/2015/wordml/symex" xmlns:wpg="http://schemas.microsoft.com/office/word/2010/wordprocessingGroup" xmlns:wpi="http://schemas.microsoft.com/office/word/2010/wordprocessingInk" xmlns:wne="http://schemas.microsoft.com/office/word/2006/wordml" xmlns:wps="http://schemas.microsoft.com/office/word/2010/wordprocessingShape" mc:Ignorable="w14 w15 w16se w16cid w16 w16cex w16sdtdh w16sdtfl w16du wp14">
   <w:endnote w:type="separator" w:id="-1">
     <w:p>
       <w:r>
@@ -12919,7 +9736,7 @@
 </file>
 
 <file path=word/footnotes.xml><?xml version="1.0" encoding="utf-8"?>
-<w:footnotes xmlns:wpc="http://schemas.microsoft.com/office/word/2010/wordprocessingCanvas" xmlns:cx="http://schemas.microsoft.com/office/drawing/2014/chartex" xmlns:cx1="http://schemas.microsoft.com/office/drawing/2015/9/8/chartex" xmlns:cx2="http://schemas.microsoft.com/office/drawing/2015/10/21/chartex" xmlns:cx3="http://schemas.microsoft.com/office/drawing/2016/5/9/chartex" xmlns:cx4="http://schemas.microsoft.com/office/drawing/2016/5/10/chartex" xmlns:cx5="http://schemas.microsoft.com/office/drawing/2016/5/11/chartex" xmlns:cx6="http://schemas.microsoft.com/office/drawing/2016/5/12/chartex" xmlns:cx7="http://schemas.microsoft.com/office/drawing/2016/5/13/chartex" xmlns:cx8="http://schemas.microsoft.com/office/drawing/2016/5/14/chartex" xmlns:mc="http://schemas.openxmlformats.org/markup-compatibility/2006" xmlns:aink="http://schemas.microsoft.com/office/drawing/2016/ink" xmlns:am3d="http://schemas.microsoft.com/office/drawing/2017/model3d" xmlns:o="urn:schemas-microsoft-com:office:office" xmlns:oel="http://schemas.microsoft.com/office/2019/extlst" xmlns:r="http://schemas.openxmlformats.org/officeDocument/2006/relationships" xmlns:m="http://schemas.openxmlformats.org/officeDocument/2006/math" xmlns:v="urn:schemas-microsoft-com:vml" xmlns:wp14="http://schemas.microsoft.com/office/word/2010/wordprocessingDrawing" xmlns:wp="http://schemas.openxmlformats.org/drawingml/2006/wordprocessingDrawing" xmlns:w10="urn:schemas-microsoft-com:office:word" xmlns:w="http://schemas.openxmlformats.org/wordprocessingml/2006/main" xmlns:w14="http://schemas.microsoft.com/office/word/2010/wordml" xmlns:w15="http://schemas.microsoft.com/office/word/2012/wordml" xmlns:w16cei="http://schemas.microsoft.com/office/word/2026/wordml/cei" xmlns:w16cex="http://schemas.microsoft.com/office/word/2018/wordml/cex" xmlns:w16cid="http://schemas.microsoft.com/office/word/2016/wordml/cid" xmlns:w16="http://schemas.microsoft.com/office/word/2018/wordml" xmlns:w16du="http://schemas.microsoft.com/office/word/2023/wordml/word16du" xmlns:w16sdtdh="http://schemas.microsoft.com/office/word/2020/wordml/sdtdatahash" xmlns:w16sdtfl="http://schemas.microsoft.com/office/word/2024/wordml/sdtformatlock" xmlns:w16se="http://schemas.microsoft.com/office/word/2015/wordml/symex" xmlns:wpg="http://schemas.microsoft.com/office/word/2010/wordprocessingGroup" xmlns:wpi="http://schemas.microsoft.com/office/word/2010/wordprocessingInk" xmlns:wne="http://schemas.microsoft.com/office/word/2006/wordml" xmlns:wps="http://schemas.microsoft.com/office/word/2010/wordprocessingShape" mc:Ignorable="w14 w15 w16se w16cid w16 w16cex w16sdtdh w16sdtfl w16du wp14">
+<w:footnotes xmlns:wpc="http://schemas.microsoft.com/office/word/2010/wordprocessingCanvas" xmlns:cx="http://schemas.microsoft.com/office/drawing/2014/chartex" xmlns:cx1="http://schemas.microsoft.com/office/drawing/2015/9/8/chartex" xmlns:cx2="http://schemas.microsoft.com/office/drawing/2015/10/21/chartex" xmlns:cx3="http://schemas.microsoft.com/office/drawing/2016/5/9/chartex" xmlns:cx4="http://schemas.microsoft.com/office/drawing/2016/5/10/chartex" xmlns:cx5="http://schemas.microsoft.com/office/drawing/2016/5/11/chartex" xmlns:cx6="http://schemas.microsoft.com/office/drawing/2016/5/12/chartex" xmlns:cx7="http://schemas.microsoft.com/office/drawing/2016/5/13/chartex" xmlns:cx8="http://schemas.microsoft.com/office/drawing/2016/5/14/chartex" xmlns:mc="http://schemas.openxmlformats.org/markup-compatibility/2006" xmlns:aink="http://schemas.microsoft.com/office/drawing/2016/ink" xmlns:am3d="http://schemas.microsoft.com/office/drawing/2017/model3d" xmlns:o="urn:schemas-microsoft-com:office:office" xmlns:oel="http://schemas.microsoft.com/office/2019/extlst" xmlns:r="http://schemas.openxmlformats.org/officeDocument/2006/relationships" xmlns:m="http://schemas.openxmlformats.org/officeDocument/2006/math" xmlns:v="urn:schemas-microsoft-com:vml" xmlns:wp14="http://schemas.microsoft.com/office/word/2010/wordprocessingDrawing" xmlns:wp="http://schemas.openxmlformats.org/drawingml/2006/wordprocessingDrawing" xmlns:w10="urn:schemas-microsoft-com:office:word" xmlns:w="http://schemas.openxmlformats.org/wordprocessingml/2006/main" xmlns:w14="http://schemas.microsoft.com/office/word/2010/wordml" xmlns:w15="http://schemas.microsoft.com/office/word/2012/wordml" xmlns:w16cex="http://schemas.microsoft.com/office/word/2018/wordml/cex" xmlns:w16cid="http://schemas.microsoft.com/office/word/2016/wordml/cid" xmlns:w16="http://schemas.microsoft.com/office/word/2018/wordml" xmlns:w16du="http://schemas.microsoft.com/office/word/2023/wordml/word16du" xmlns:w16sdtdh="http://schemas.microsoft.com/office/word/2020/wordml/sdtdatahash" xmlns:w16sdtfl="http://schemas.microsoft.com/office/word/2024/wordml/sdtformatlock" xmlns:w16se="http://schemas.microsoft.com/office/word/2015/wordml/symex" xmlns:wpg="http://schemas.microsoft.com/office/word/2010/wordprocessingGroup" xmlns:wpi="http://schemas.microsoft.com/office/word/2010/wordprocessingInk" xmlns:wne="http://schemas.microsoft.com/office/word/2006/wordml" xmlns:wps="http://schemas.microsoft.com/office/word/2010/wordprocessingShape" mc:Ignorable="w14 w15 w16se w16cid w16 w16cex w16sdtdh w16sdtfl w16du wp14">
   <w:footnote w:type="separator" w:id="-1">
     <w:p>
       <w:r>
@@ -12938,70 +9755,7 @@
 </file>
 
 <file path=word/header1.xml><?xml version="1.0" encoding="utf-8"?>
-<w:hdr xmlns:wpc="http://schemas.microsoft.com/office/word/2010/wordprocessingCanvas" xmlns:cx="http://schemas.microsoft.com/office/drawing/2014/chartex" xmlns:cx1="http://schemas.microsoft.com/office/drawing/2015/9/8/chartex" xmlns:cx2="http://schemas.microsoft.com/office/drawing/2015/10/21/chartex" xmlns:cx3="http://schemas.microsoft.com/office/drawing/2016/5/9/chartex" xmlns:cx4="http://schemas.microsoft.com/office/drawing/2016/5/10/chartex" xmlns:cx5="http://schemas.microsoft.com/office/drawing/2016/5/11/chartex" xmlns:cx6="http://schemas.microsoft.com/office/drawing/2016/5/12/chartex" xmlns:cx7="http://schemas.microsoft.com/office/drawing/2016/5/13/chartex" xmlns:cx8="http://schemas.microsoft.com/office/drawing/2016/5/14/chartex" xmlns:mc="http://schemas.openxmlformats.org/markup-compatibility/2006" xmlns:aink="http://schemas.microsoft.com/office/drawing/2016/ink" xmlns:am3d="http://schemas.microsoft.com/office/drawing/2017/model3d" xmlns:o="urn:schemas-microsoft-com:office:office" xmlns:oel="http://schemas.microsoft.com/office/2019/extlst" xmlns:r="http://schemas.openxmlformats.org/officeDocument/2006/relationships" xmlns:m="http://schemas.openxmlformats.org/officeDocument/2006/math" xmlns:v="urn:schemas-microsoft-com:vml" xmlns:wp14="http://schemas.microsoft.com/office/word/2010/wordprocessingDrawing" xmlns:wp="http://schemas.openxmlformats.org/drawingml/2006/wordprocessingDrawing" xmlns:w10="urn:schemas-microsoft-com:office:word" xmlns:w="http://schemas.openxmlformats.org/wordprocessingml/2006/main" xmlns:w14="http://schemas.microsoft.com/office/word/2010/wordml" xmlns:w15="http://schemas.microsoft.com/office/word/2012/wordml" xmlns:w16cei="http://schemas.microsoft.com/office/word/2026/wordml/cei" xmlns:w16cex="http://schemas.microsoft.com/office/word/2018/wordml/cex" xmlns:w16cid="http://schemas.microsoft.com/office/word/2016/wordml/cid" xmlns:w16="http://schemas.microsoft.com/office/word/2018/wordml" xmlns:w16du="http://schemas.microsoft.com/office/word/2023/wordml/word16du" xmlns:w16sdtdh="http://schemas.microsoft.com/office/word/2020/wordml/sdtdatahash" xmlns:w16sdtfl="http://schemas.microsoft.com/office/word/2024/wordml/sdtformatlock" xmlns:w16se="http://schemas.microsoft.com/office/word/2015/wordml/symex" xmlns:wpg="http://schemas.microsoft.com/office/word/2010/wordprocessingGroup" xmlns:wpi="http://schemas.microsoft.com/office/word/2010/wordprocessingInk" xmlns:wne="http://schemas.microsoft.com/office/word/2006/wordml" xmlns:wps="http://schemas.microsoft.com/office/word/2010/wordprocessingShape" mc:Ignorable="w14 w15 w16se w16cid w16 w16cex w16sdtdh w16sdtfl w16du wp14">
-  <w:p>
-    <w:pPr>
-      <w:pStyle w:val="BodyText"/>
-      <w:spacing w:line="14" w:lineRule="auto"/>
-      <w:rPr>
-        <w:b w:val="0"/>
-      </w:rPr>
-    </w:pPr>
-    <w:r>
-      <w:rPr>
-        <w:b w:val="0"/>
-        <w:noProof/>
-      </w:rPr>
-      <w:drawing>
-        <wp:anchor distT="0" distB="0" distL="0" distR="0" simplePos="0" relativeHeight="487360512" behindDoc="1" locked="0" layoutInCell="1" allowOverlap="1" wp14:anchorId="688F712A" wp14:editId="61F54101">
-          <wp:simplePos x="0" y="0"/>
-          <wp:positionH relativeFrom="page">
-            <wp:posOffset>1374937</wp:posOffset>
-          </wp:positionH>
-          <wp:positionV relativeFrom="page">
-            <wp:posOffset>933450</wp:posOffset>
-          </wp:positionV>
-          <wp:extent cx="4810125" cy="1543050"/>
-          <wp:effectExtent l="0" t="0" r="0" b="0"/>
-          <wp:wrapNone/>
-          <wp:docPr id="1" name="Image 1"/>
-          <wp:cNvGraphicFramePr>
-            <a:graphicFrameLocks xmlns:a="http://schemas.openxmlformats.org/drawingml/2006/main"/>
-          </wp:cNvGraphicFramePr>
-          <a:graphic xmlns:a="http://schemas.openxmlformats.org/drawingml/2006/main">
-            <a:graphicData uri="http://schemas.openxmlformats.org/drawingml/2006/picture">
-              <pic:pic xmlns:pic="http://schemas.openxmlformats.org/drawingml/2006/picture">
-                <pic:nvPicPr>
-                  <pic:cNvPr id="1" name="Image 1"/>
-                  <pic:cNvPicPr/>
-                </pic:nvPicPr>
-                <pic:blipFill>
-                  <a:blip r:embed="rId1" cstate="print"/>
-                  <a:stretch>
-                    <a:fillRect/>
-                  </a:stretch>
-                </pic:blipFill>
-                <pic:spPr>
-                  <a:xfrm>
-                    <a:off x="0" y="0"/>
-                    <a:ext cx="4810125" cy="1543050"/>
-                  </a:xfrm>
-                  <a:prstGeom prst="rect">
-                    <a:avLst/>
-                  </a:prstGeom>
-                </pic:spPr>
-              </pic:pic>
-            </a:graphicData>
-          </a:graphic>
-        </wp:anchor>
-      </w:drawing>
-    </w:r>
-  </w:p>
-</w:hdr>
-</file>
-
-<file path=word/header2.xml><?xml version="1.0" encoding="utf-8"?>
-<w:hdr xmlns:wpc="http://schemas.microsoft.com/office/word/2010/wordprocessingCanvas" xmlns:cx="http://schemas.microsoft.com/office/drawing/2014/chartex" xmlns:cx1="http://schemas.microsoft.com/office/drawing/2015/9/8/chartex" xmlns:cx2="http://schemas.microsoft.com/office/drawing/2015/10/21/chartex" xmlns:cx3="http://schemas.microsoft.com/office/drawing/2016/5/9/chartex" xmlns:cx4="http://schemas.microsoft.com/office/drawing/2016/5/10/chartex" xmlns:cx5="http://schemas.microsoft.com/office/drawing/2016/5/11/chartex" xmlns:cx6="http://schemas.microsoft.com/office/drawing/2016/5/12/chartex" xmlns:cx7="http://schemas.microsoft.com/office/drawing/2016/5/13/chartex" xmlns:cx8="http://schemas.microsoft.com/office/drawing/2016/5/14/chartex" xmlns:mc="http://schemas.openxmlformats.org/markup-compatibility/2006" xmlns:aink="http://schemas.microsoft.com/office/drawing/2016/ink" xmlns:am3d="http://schemas.microsoft.com/office/drawing/2017/model3d" xmlns:o="urn:schemas-microsoft-com:office:office" xmlns:oel="http://schemas.microsoft.com/office/2019/extlst" xmlns:r="http://schemas.openxmlformats.org/officeDocument/2006/relationships" xmlns:m="http://schemas.openxmlformats.org/officeDocument/2006/math" xmlns:v="urn:schemas-microsoft-com:vml" xmlns:wp14="http://schemas.microsoft.com/office/word/2010/wordprocessingDrawing" xmlns:wp="http://schemas.openxmlformats.org/drawingml/2006/wordprocessingDrawing" xmlns:w10="urn:schemas-microsoft-com:office:word" xmlns:w="http://schemas.openxmlformats.org/wordprocessingml/2006/main" xmlns:w14="http://schemas.microsoft.com/office/word/2010/wordml" xmlns:w15="http://schemas.microsoft.com/office/word/2012/wordml" xmlns:w16cei="http://schemas.microsoft.com/office/word/2026/wordml/cei" xmlns:w16cex="http://schemas.microsoft.com/office/word/2018/wordml/cex" xmlns:w16cid="http://schemas.microsoft.com/office/word/2016/wordml/cid" xmlns:w16="http://schemas.microsoft.com/office/word/2018/wordml" xmlns:w16du="http://schemas.microsoft.com/office/word/2023/wordml/word16du" xmlns:w16sdtdh="http://schemas.microsoft.com/office/word/2020/wordml/sdtdatahash" xmlns:w16sdtfl="http://schemas.microsoft.com/office/word/2024/wordml/sdtformatlock" xmlns:w16se="http://schemas.microsoft.com/office/word/2015/wordml/symex" xmlns:wpg="http://schemas.microsoft.com/office/word/2010/wordprocessingGroup" xmlns:wpi="http://schemas.microsoft.com/office/word/2010/wordprocessingInk" xmlns:wne="http://schemas.microsoft.com/office/word/2006/wordml" xmlns:wps="http://schemas.microsoft.com/office/word/2010/wordprocessingShape" mc:Ignorable="w14 w15 w16se w16cid w16 w16cex w16sdtdh w16sdtfl w16du wp14">
+<w:hdr xmlns:wpc="http://schemas.microsoft.com/office/word/2010/wordprocessingCanvas" xmlns:cx="http://schemas.microsoft.com/office/drawing/2014/chartex" xmlns:cx1="http://schemas.microsoft.com/office/drawing/2015/9/8/chartex" xmlns:cx2="http://schemas.microsoft.com/office/drawing/2015/10/21/chartex" xmlns:cx3="http://schemas.microsoft.com/office/drawing/2016/5/9/chartex" xmlns:cx4="http://schemas.microsoft.com/office/drawing/2016/5/10/chartex" xmlns:cx5="http://schemas.microsoft.com/office/drawing/2016/5/11/chartex" xmlns:cx6="http://schemas.microsoft.com/office/drawing/2016/5/12/chartex" xmlns:cx7="http://schemas.microsoft.com/office/drawing/2016/5/13/chartex" xmlns:cx8="http://schemas.microsoft.com/office/drawing/2016/5/14/chartex" xmlns:mc="http://schemas.openxmlformats.org/markup-compatibility/2006" xmlns:aink="http://schemas.microsoft.com/office/drawing/2016/ink" xmlns:am3d="http://schemas.microsoft.com/office/drawing/2017/model3d" xmlns:o="urn:schemas-microsoft-com:office:office" xmlns:oel="http://schemas.microsoft.com/office/2019/extlst" xmlns:r="http://schemas.openxmlformats.org/officeDocument/2006/relationships" xmlns:m="http://schemas.openxmlformats.org/officeDocument/2006/math" xmlns:v="urn:schemas-microsoft-com:vml" xmlns:wp14="http://schemas.microsoft.com/office/word/2010/wordprocessingDrawing" xmlns:wp="http://schemas.openxmlformats.org/drawingml/2006/wordprocessingDrawing" xmlns:w10="urn:schemas-microsoft-com:office:word" xmlns:w="http://schemas.openxmlformats.org/wordprocessingml/2006/main" xmlns:w14="http://schemas.microsoft.com/office/word/2010/wordml" xmlns:w15="http://schemas.microsoft.com/office/word/2012/wordml" xmlns:w16cex="http://schemas.microsoft.com/office/word/2018/wordml/cex" xmlns:w16cid="http://schemas.microsoft.com/office/word/2016/wordml/cid" xmlns:w16="http://schemas.microsoft.com/office/word/2018/wordml" xmlns:w16du="http://schemas.microsoft.com/office/word/2023/wordml/word16du" xmlns:w16sdtdh="http://schemas.microsoft.com/office/word/2020/wordml/sdtdatahash" xmlns:w16sdtfl="http://schemas.microsoft.com/office/word/2024/wordml/sdtformatlock" xmlns:w16se="http://schemas.microsoft.com/office/word/2015/wordml/symex" xmlns:wpg="http://schemas.microsoft.com/office/word/2010/wordprocessingGroup" xmlns:wpi="http://schemas.microsoft.com/office/word/2010/wordprocessingInk" xmlns:wne="http://schemas.microsoft.com/office/word/2006/wordml" xmlns:wps="http://schemas.microsoft.com/office/word/2010/wordprocessingShape" mc:Ignorable="w14 w15 w16se w16cid w16 w16cex w16sdtdh w16sdtfl w16du wp14">
   <w:p>
     <w:pPr>
       <w:pStyle w:val="BodyText"/>

</xml_diff>